<commit_message>
New Lines Added to Xpath Notes 23-27
</commit_message>
<xml_diff>
--- a/Xpath Notes.docx
+++ b/Xpath Notes.docx
@@ -1,6 +1,6 @@
 
 <file path=word/document.xml><?xml version="1.0" encoding="utf-8"?>
-<w:document xmlns:wpc="http://schemas.microsoft.com/office/word/2010/wordprocessingCanvas" xmlns:cx="http://schemas.microsoft.com/office/drawing/2014/chartex" xmlns:mc="http://schemas.openxmlformats.org/markup-compatibility/2006" xmlns:o="urn:schemas-microsoft-com:office:office" xmlns:r="http://schemas.openxmlformats.org/officeDocument/2006/relationships" xmlns:m="http://schemas.openxmlformats.org/officeDocument/2006/math" xmlns:v="urn:schemas-microsoft-com:vml" xmlns:wp14="http://schemas.microsoft.com/office/word/2010/wordprocessingDrawing" xmlns:wp="http://schemas.openxmlformats.org/drawingml/2006/wordprocessingDrawing" xmlns:w10="urn:schemas-microsoft-com:office:word" xmlns:w="http://schemas.openxmlformats.org/wordprocessingml/2006/main" xmlns:w14="http://schemas.microsoft.com/office/word/2010/wordml" xmlns:w15="http://schemas.microsoft.com/office/word/2012/wordml" xmlns:w16se="http://schemas.microsoft.com/office/word/2015/wordml/symex" xmlns:wpg="http://schemas.microsoft.com/office/word/2010/wordprocessingGroup" xmlns:wpi="http://schemas.microsoft.com/office/word/2010/wordprocessingInk" xmlns:wne="http://schemas.microsoft.com/office/word/2006/wordml" xmlns:wps="http://schemas.microsoft.com/office/word/2010/wordprocessingShape" mc:Ignorable="w14 w15 w16se wp14">
+<w:document xmlns:wpc="http://schemas.microsoft.com/office/word/2010/wordprocessingCanvas" xmlns:cx="http://schemas.microsoft.com/office/drawing/2014/chartex" xmlns:cx1="http://schemas.microsoft.com/office/drawing/2015/9/8/chartex" xmlns:cx2="http://schemas.microsoft.com/office/drawing/2015/10/21/chartex" xmlns:cx3="http://schemas.microsoft.com/office/drawing/2016/5/9/chartex" xmlns:cx4="http://schemas.microsoft.com/office/drawing/2016/5/10/chartex" xmlns:cx5="http://schemas.microsoft.com/office/drawing/2016/5/11/chartex" xmlns:cx6="http://schemas.microsoft.com/office/drawing/2016/5/12/chartex" xmlns:cx7="http://schemas.microsoft.com/office/drawing/2016/5/13/chartex" xmlns:cx8="http://schemas.microsoft.com/office/drawing/2016/5/14/chartex" xmlns:mc="http://schemas.openxmlformats.org/markup-compatibility/2006" xmlns:aink="http://schemas.microsoft.com/office/drawing/2016/ink" xmlns:am3d="http://schemas.microsoft.com/office/drawing/2017/model3d" xmlns:o="urn:schemas-microsoft-com:office:office" xmlns:oel="http://schemas.microsoft.com/office/2019/extlst" xmlns:r="http://schemas.openxmlformats.org/officeDocument/2006/relationships" xmlns:m="http://schemas.openxmlformats.org/officeDocument/2006/math" xmlns:v="urn:schemas-microsoft-com:vml" xmlns:wp14="http://schemas.microsoft.com/office/word/2010/wordprocessingDrawing" xmlns:wp="http://schemas.openxmlformats.org/drawingml/2006/wordprocessingDrawing" xmlns:w10="urn:schemas-microsoft-com:office:word" xmlns:w="http://schemas.openxmlformats.org/wordprocessingml/2006/main" xmlns:w14="http://schemas.microsoft.com/office/word/2010/wordml" xmlns:w15="http://schemas.microsoft.com/office/word/2012/wordml" xmlns:w16cex="http://schemas.microsoft.com/office/word/2018/wordml/cex" xmlns:w16cid="http://schemas.microsoft.com/office/word/2016/wordml/cid" xmlns:w16="http://schemas.microsoft.com/office/word/2018/wordml" xmlns:w16du="http://schemas.microsoft.com/office/word/2023/wordml/word16du" xmlns:w16sdtdh="http://schemas.microsoft.com/office/word/2020/wordml/sdtdatahash" xmlns:w16se="http://schemas.microsoft.com/office/word/2015/wordml/symex" xmlns:wpg="http://schemas.microsoft.com/office/word/2010/wordprocessingGroup" xmlns:wpi="http://schemas.microsoft.com/office/word/2010/wordprocessingInk" xmlns:wne="http://schemas.microsoft.com/office/word/2006/wordml" xmlns:wps="http://schemas.microsoft.com/office/word/2010/wordprocessingShape" mc:Ignorable="w14 w15 w16se w16cid w16 w16cex w16sdtdh w16du wp14">
   <w:body>
     <w:p>
       <w:pPr>
@@ -242,23 +242,7 @@
           <w:sz w:val="32"/>
           <w:szCs w:val="32"/>
         </w:rPr>
-        <w:t xml:space="preserve">will never find id &amp; name unique </w:t>
-      </w:r>
-      <w:proofErr w:type="gramStart"/>
-      <w:r>
-        <w:rPr>
-          <w:sz w:val="32"/>
-          <w:szCs w:val="32"/>
-        </w:rPr>
-        <w:t>attribute ,</w:t>
-      </w:r>
-      <w:proofErr w:type="gramEnd"/>
-      <w:r>
-        <w:rPr>
-          <w:sz w:val="32"/>
-          <w:szCs w:val="32"/>
-        </w:rPr>
-        <w:t xml:space="preserve"> in</w:t>
+        <w:t>will never find id &amp; name unique attribute , in</w:t>
       </w:r>
       <w:r>
         <w:rPr>
@@ -303,7 +287,6 @@
         </w:rPr>
       </w:pPr>
       <w:proofErr w:type="spellStart"/>
-      <w:proofErr w:type="gramStart"/>
       <w:r>
         <w:rPr>
           <w:color w:val="C00000"/>
@@ -319,16 +302,7 @@
           <w:sz w:val="32"/>
           <w:szCs w:val="32"/>
         </w:rPr>
-        <w:t xml:space="preserve"> :</w:t>
-      </w:r>
-      <w:proofErr w:type="gramEnd"/>
-      <w:r>
-        <w:rPr>
-          <w:color w:val="C00000"/>
-          <w:sz w:val="32"/>
-          <w:szCs w:val="32"/>
-        </w:rPr>
-        <w:t xml:space="preserve"> </w:t>
+        <w:t xml:space="preserve"> : </w:t>
       </w:r>
     </w:p>
     <w:p>
@@ -428,30 +402,14 @@
           <w:sz w:val="32"/>
           <w:szCs w:val="32"/>
         </w:rPr>
-        <w:t xml:space="preserve"> </w:t>
-      </w:r>
-      <w:proofErr w:type="gramStart"/>
-      <w:r>
-        <w:rPr>
-          <w:sz w:val="32"/>
-          <w:szCs w:val="32"/>
-        </w:rPr>
-        <w:t xml:space="preserve">&amp; </w:t>
-      </w:r>
-      <w:r>
-        <w:rPr>
-          <w:sz w:val="32"/>
-          <w:szCs w:val="32"/>
-        </w:rPr>
-        <w:t xml:space="preserve"> visible</w:t>
-      </w:r>
-      <w:proofErr w:type="gramEnd"/>
-      <w:r>
-        <w:rPr>
-          <w:sz w:val="32"/>
-          <w:szCs w:val="32"/>
-        </w:rPr>
-        <w:t xml:space="preserve"> text[inner text]</w:t>
+        <w:t xml:space="preserve"> &amp; </w:t>
+      </w:r>
+      <w:r>
+        <w:rPr>
+          <w:sz w:val="32"/>
+          <w:szCs w:val="32"/>
+        </w:rPr>
+        <w:t xml:space="preserve"> visible text[inner text]</w:t>
       </w:r>
     </w:p>
     <w:p>
@@ -536,21 +494,12 @@
           <w:szCs w:val="28"/>
         </w:rPr>
       </w:pPr>
-      <w:proofErr w:type="gramStart"/>
-      <w:r>
-        <w:rPr>
-          <w:sz w:val="28"/>
-          <w:szCs w:val="28"/>
-        </w:rPr>
-        <w:t>/  -</w:t>
-      </w:r>
-      <w:proofErr w:type="gramEnd"/>
-      <w:r>
-        <w:rPr>
-          <w:sz w:val="28"/>
-          <w:szCs w:val="28"/>
-        </w:rPr>
-        <w:t xml:space="preserve">&gt; traverse from </w:t>
+      <w:r>
+        <w:rPr>
+          <w:sz w:val="28"/>
+          <w:szCs w:val="28"/>
+        </w:rPr>
+        <w:t xml:space="preserve">/  -&gt; traverse from </w:t>
       </w:r>
       <w:proofErr w:type="spellStart"/>
       <w:r>
@@ -631,7 +580,6 @@
           <w:szCs w:val="28"/>
         </w:rPr>
       </w:pPr>
-      <w:proofErr w:type="gramStart"/>
       <w:r>
         <w:rPr>
           <w:sz w:val="28"/>
@@ -651,15 +599,7 @@
           <w:sz w:val="28"/>
           <w:szCs w:val="28"/>
         </w:rPr>
-        <w:t>]</w:t>
-      </w:r>
-      <w:proofErr w:type="gramEnd"/>
-      <w:r>
-        <w:rPr>
-          <w:sz w:val="28"/>
-          <w:szCs w:val="28"/>
-        </w:rPr>
-        <w:t xml:space="preserve"> -&gt; provide </w:t>
+        <w:t xml:space="preserve">] -&gt; provide </w:t>
       </w:r>
       <w:r>
         <w:rPr>
@@ -739,21 +679,12 @@
         <w:t>htmlTag</w:t>
       </w:r>
       <w:proofErr w:type="spellEnd"/>
-      <w:proofErr w:type="gramStart"/>
-      <w:r>
-        <w:rPr>
-          <w:sz w:val="28"/>
-          <w:szCs w:val="28"/>
-        </w:rPr>
-        <w:t xml:space="preserve">   [</w:t>
-      </w:r>
-      <w:proofErr w:type="gramEnd"/>
-      <w:r>
-        <w:rPr>
-          <w:sz w:val="28"/>
-          <w:szCs w:val="28"/>
-        </w:rPr>
-        <w:t>regular expression ]</w:t>
+      <w:r>
+        <w:rPr>
+          <w:sz w:val="28"/>
+          <w:szCs w:val="28"/>
+        </w:rPr>
+        <w:t xml:space="preserve">   [regular expression ]</w:t>
       </w:r>
     </w:p>
     <w:p>
@@ -852,33 +783,15 @@
           <w:sz w:val="28"/>
           <w:szCs w:val="28"/>
         </w:rPr>
-        <w:t xml:space="preserve"> </w:t>
-      </w:r>
-      <w:proofErr w:type="gramStart"/>
+        <w:t xml:space="preserve"> axes</w:t>
+      </w:r>
       <w:r>
         <w:rPr>
           <w:color w:val="FF0000"/>
           <w:sz w:val="28"/>
           <w:szCs w:val="28"/>
         </w:rPr>
-        <w:t>axes</w:t>
-      </w:r>
-      <w:r>
-        <w:rPr>
-          <w:color w:val="FF0000"/>
-          <w:sz w:val="28"/>
-          <w:szCs w:val="28"/>
-        </w:rPr>
-        <w:t xml:space="preserve">  [</w:t>
-      </w:r>
-      <w:proofErr w:type="gramEnd"/>
-      <w:r>
-        <w:rPr>
-          <w:color w:val="FF0000"/>
-          <w:sz w:val="28"/>
-          <w:szCs w:val="28"/>
-        </w:rPr>
-        <w:t xml:space="preserve">used for </w:t>
+        <w:t xml:space="preserve">  [used for </w:t>
       </w:r>
       <w:proofErr w:type="spellStart"/>
       <w:r>
@@ -1008,23 +921,7 @@
           <w:sz w:val="28"/>
           <w:szCs w:val="28"/>
         </w:rPr>
-        <w:t>/preceding-</w:t>
-      </w:r>
-      <w:proofErr w:type="gramStart"/>
-      <w:r>
-        <w:rPr>
-          <w:sz w:val="28"/>
-          <w:szCs w:val="28"/>
-        </w:rPr>
-        <w:t>sibling::</w:t>
-      </w:r>
-      <w:proofErr w:type="gramEnd"/>
-      <w:r>
-        <w:rPr>
-          <w:sz w:val="28"/>
-          <w:szCs w:val="28"/>
-        </w:rPr>
-        <w:t xml:space="preserve"> -&gt; traverse from </w:t>
+        <w:t xml:space="preserve">/preceding-sibling:: -&gt; traverse from </w:t>
       </w:r>
       <w:proofErr w:type="spellStart"/>
       <w:r>
@@ -1081,17 +978,61 @@
           <w:sz w:val="28"/>
           <w:szCs w:val="28"/>
         </w:rPr>
-        <w:t>/</w:t>
-      </w:r>
-      <w:proofErr w:type="gramStart"/>
-      <w:r>
-        <w:rPr>
-          <w:sz w:val="28"/>
-          <w:szCs w:val="28"/>
-        </w:rPr>
-        <w:t>descendant::</w:t>
-      </w:r>
-      <w:proofErr w:type="gramEnd"/>
+        <w:t xml:space="preserve">/descendant:: </w:t>
+      </w:r>
+      <w:r>
+        <w:rPr>
+          <w:sz w:val="28"/>
+          <w:szCs w:val="28"/>
+        </w:rPr>
+        <w:t xml:space="preserve">From the current node </w:t>
+      </w:r>
+      <w:r>
+        <w:rPr>
+          <w:sz w:val="28"/>
+          <w:szCs w:val="28"/>
+        </w:rPr>
+        <w:t>skip all sub sub</w:t>
+      </w:r>
+      <w:r>
+        <w:rPr>
+          <w:sz w:val="28"/>
+          <w:szCs w:val="28"/>
+        </w:rPr>
+        <w:t>….</w:t>
+      </w:r>
+      <w:r>
+        <w:rPr>
+          <w:sz w:val="28"/>
+          <w:szCs w:val="28"/>
+        </w:rPr>
+        <w:t xml:space="preserve"> child nodes &amp; navigate required descendant node</w:t>
+      </w:r>
+    </w:p>
+    <w:p>
+      <w:pPr>
+        <w:tabs>
+          <w:tab w:val="left" w:pos="1804"/>
+        </w:tabs>
+        <w:rPr>
+          <w:sz w:val="28"/>
+          <w:szCs w:val="28"/>
+        </w:rPr>
+      </w:pPr>
+      <w:r>
+        <w:rPr>
+          <w:sz w:val="28"/>
+          <w:szCs w:val="28"/>
+        </w:rPr>
+        <w:t>/ancestor:</w:t>
+      </w:r>
+      <w:r>
+        <w:rPr>
+          <w:sz w:val="28"/>
+          <w:szCs w:val="28"/>
+        </w:rPr>
+        <w:t>:</w:t>
+      </w:r>
       <w:r>
         <w:rPr>
           <w:sz w:val="28"/>
@@ -1104,63 +1045,26 @@
           <w:sz w:val="28"/>
           <w:szCs w:val="28"/>
         </w:rPr>
-        <w:t xml:space="preserve">From the current node </w:t>
-      </w:r>
-      <w:r>
-        <w:rPr>
-          <w:sz w:val="28"/>
-          <w:szCs w:val="28"/>
-        </w:rPr>
-        <w:t>skip all sub sub</w:t>
-      </w:r>
-      <w:r>
-        <w:rPr>
-          <w:sz w:val="28"/>
-          <w:szCs w:val="28"/>
-        </w:rPr>
-        <w:t>….</w:t>
-      </w:r>
-      <w:r>
-        <w:rPr>
-          <w:sz w:val="28"/>
-          <w:szCs w:val="28"/>
-        </w:rPr>
-        <w:t xml:space="preserve"> child nodes &amp; navigate required descendant node</w:t>
-      </w:r>
-    </w:p>
-    <w:p>
-      <w:pPr>
-        <w:tabs>
-          <w:tab w:val="left" w:pos="1804"/>
-        </w:tabs>
-        <w:rPr>
-          <w:sz w:val="28"/>
-          <w:szCs w:val="28"/>
-        </w:rPr>
-      </w:pPr>
-      <w:r>
-        <w:rPr>
-          <w:sz w:val="28"/>
-          <w:szCs w:val="28"/>
-        </w:rPr>
-        <w:t>/</w:t>
-      </w:r>
-      <w:proofErr w:type="gramStart"/>
-      <w:r>
-        <w:rPr>
-          <w:sz w:val="28"/>
-          <w:szCs w:val="28"/>
-        </w:rPr>
-        <w:t>ancestor:</w:t>
-      </w:r>
-      <w:r>
-        <w:rPr>
-          <w:sz w:val="28"/>
-          <w:szCs w:val="28"/>
-        </w:rPr>
-        <w:t>:</w:t>
-      </w:r>
-      <w:proofErr w:type="gramEnd"/>
+        <w:t>skip all parents nodes &amp; navigate required super parent node</w:t>
+      </w:r>
+    </w:p>
+    <w:p>
+      <w:pPr>
+        <w:tabs>
+          <w:tab w:val="left" w:pos="1804"/>
+        </w:tabs>
+        <w:rPr>
+          <w:sz w:val="28"/>
+          <w:szCs w:val="28"/>
+        </w:rPr>
+      </w:pPr>
+      <w:r>
+        <w:rPr>
+          <w:sz w:val="28"/>
+          <w:szCs w:val="28"/>
+        </w:rPr>
+        <w:t>/child::</w:t>
+      </w:r>
       <w:r>
         <w:rPr>
           <w:sz w:val="28"/>
@@ -1173,35 +1077,51 @@
           <w:sz w:val="28"/>
           <w:szCs w:val="28"/>
         </w:rPr>
-        <w:t>skip all parents nodes &amp; navigate required super parent node</w:t>
-      </w:r>
-    </w:p>
-    <w:p>
-      <w:pPr>
-        <w:tabs>
-          <w:tab w:val="left" w:pos="1804"/>
-        </w:tabs>
-        <w:rPr>
-          <w:sz w:val="28"/>
-          <w:szCs w:val="28"/>
-        </w:rPr>
-      </w:pPr>
-      <w:r>
-        <w:rPr>
-          <w:sz w:val="28"/>
-          <w:szCs w:val="28"/>
-        </w:rPr>
-        <w:t>/</w:t>
-      </w:r>
-      <w:proofErr w:type="gramStart"/>
-      <w:r>
-        <w:rPr>
-          <w:sz w:val="28"/>
-          <w:szCs w:val="28"/>
-        </w:rPr>
-        <w:t>child::</w:t>
-      </w:r>
-      <w:proofErr w:type="gramEnd"/>
+        <w:t xml:space="preserve">traverse from </w:t>
+      </w:r>
+      <w:proofErr w:type="spellStart"/>
+      <w:r>
+        <w:rPr>
+          <w:sz w:val="28"/>
+          <w:szCs w:val="28"/>
+        </w:rPr>
+        <w:t>parentHTMLTag</w:t>
+      </w:r>
+      <w:proofErr w:type="spellEnd"/>
+      <w:r>
+        <w:rPr>
+          <w:sz w:val="28"/>
+          <w:szCs w:val="28"/>
+        </w:rPr>
+        <w:t xml:space="preserve"> to </w:t>
+      </w:r>
+      <w:proofErr w:type="spellStart"/>
+      <w:r>
+        <w:rPr>
+          <w:sz w:val="28"/>
+          <w:szCs w:val="28"/>
+        </w:rPr>
+        <w:t>childHTMLTag</w:t>
+      </w:r>
+      <w:proofErr w:type="spellEnd"/>
+    </w:p>
+    <w:p>
+      <w:pPr>
+        <w:tabs>
+          <w:tab w:val="left" w:pos="1804"/>
+        </w:tabs>
+        <w:rPr>
+          <w:sz w:val="28"/>
+          <w:szCs w:val="28"/>
+        </w:rPr>
+      </w:pPr>
+      <w:r>
+        <w:rPr>
+          <w:sz w:val="28"/>
+          <w:szCs w:val="28"/>
+        </w:rPr>
+        <w:t>/parent::</w:t>
+      </w:r>
       <w:r>
         <w:rPr>
           <w:sz w:val="28"/>
@@ -1214,7 +1134,7 @@
           <w:sz w:val="28"/>
           <w:szCs w:val="28"/>
         </w:rPr>
-        <w:t xml:space="preserve">traverse from </w:t>
+        <w:t xml:space="preserve">Traverse from </w:t>
       </w:r>
       <w:proofErr w:type="spellStart"/>
       <w:r>
@@ -1222,130 +1142,64 @@
           <w:sz w:val="28"/>
           <w:szCs w:val="28"/>
         </w:rPr>
+        <w:t>childHTMLTag</w:t>
+      </w:r>
+      <w:proofErr w:type="spellEnd"/>
+      <w:r>
+        <w:rPr>
+          <w:sz w:val="28"/>
+          <w:szCs w:val="28"/>
+        </w:rPr>
+        <w:t xml:space="preserve"> to </w:t>
+      </w:r>
+      <w:proofErr w:type="spellStart"/>
+      <w:r>
+        <w:rPr>
+          <w:sz w:val="28"/>
+          <w:szCs w:val="28"/>
+        </w:rPr>
         <w:t>parentHTMLTag</w:t>
       </w:r>
       <w:proofErr w:type="spellEnd"/>
-      <w:r>
-        <w:rPr>
-          <w:sz w:val="28"/>
-          <w:szCs w:val="28"/>
-        </w:rPr>
-        <w:t xml:space="preserve"> to </w:t>
+    </w:p>
+    <w:p>
+      <w:pPr>
+        <w:tabs>
+          <w:tab w:val="left" w:pos="1804"/>
+        </w:tabs>
+        <w:rPr>
+          <w:sz w:val="28"/>
+          <w:szCs w:val="28"/>
+        </w:rPr>
+      </w:pPr>
+    </w:p>
+    <w:p>
+      <w:pPr>
+        <w:tabs>
+          <w:tab w:val="left" w:pos="1804"/>
+        </w:tabs>
+        <w:rPr>
+          <w:sz w:val="28"/>
+          <w:szCs w:val="28"/>
+        </w:rPr>
+      </w:pPr>
+      <w:r>
+        <w:rPr>
+          <w:sz w:val="28"/>
+          <w:szCs w:val="28"/>
+        </w:rPr>
+        <w:t>=========</w:t>
       </w:r>
       <w:proofErr w:type="spellStart"/>
       <w:r>
         <w:rPr>
-          <w:sz w:val="28"/>
-          <w:szCs w:val="28"/>
-        </w:rPr>
-        <w:t>childHTMLTag</w:t>
+          <w:color w:val="C00000"/>
+          <w:sz w:val="28"/>
+          <w:szCs w:val="28"/>
+        </w:rPr>
+        <w:t>Xpath</w:t>
       </w:r>
       <w:proofErr w:type="spellEnd"/>
-    </w:p>
-    <w:p>
-      <w:pPr>
-        <w:tabs>
-          <w:tab w:val="left" w:pos="1804"/>
-        </w:tabs>
-        <w:rPr>
-          <w:sz w:val="28"/>
-          <w:szCs w:val="28"/>
-        </w:rPr>
-      </w:pPr>
-      <w:r>
-        <w:rPr>
-          <w:sz w:val="28"/>
-          <w:szCs w:val="28"/>
-        </w:rPr>
-        <w:t>/</w:t>
-      </w:r>
-      <w:proofErr w:type="gramStart"/>
-      <w:r>
-        <w:rPr>
-          <w:sz w:val="28"/>
-          <w:szCs w:val="28"/>
-        </w:rPr>
-        <w:t>parent::</w:t>
-      </w:r>
-      <w:proofErr w:type="gramEnd"/>
-      <w:r>
-        <w:rPr>
-          <w:sz w:val="28"/>
-          <w:szCs w:val="28"/>
-        </w:rPr>
-        <w:t xml:space="preserve"> </w:t>
-      </w:r>
-      <w:r>
-        <w:rPr>
-          <w:sz w:val="28"/>
-          <w:szCs w:val="28"/>
-        </w:rPr>
-        <w:t xml:space="preserve">Traverse from </w:t>
-      </w:r>
-      <w:proofErr w:type="spellStart"/>
-      <w:r>
-        <w:rPr>
-          <w:sz w:val="28"/>
-          <w:szCs w:val="28"/>
-        </w:rPr>
-        <w:t>childHTMLTag</w:t>
-      </w:r>
-      <w:proofErr w:type="spellEnd"/>
-      <w:r>
-        <w:rPr>
-          <w:sz w:val="28"/>
-          <w:szCs w:val="28"/>
-        </w:rPr>
-        <w:t xml:space="preserve"> to </w:t>
-      </w:r>
-      <w:proofErr w:type="spellStart"/>
-      <w:r>
-        <w:rPr>
-          <w:sz w:val="28"/>
-          <w:szCs w:val="28"/>
-        </w:rPr>
-        <w:t>parentHTMLTag</w:t>
-      </w:r>
-      <w:proofErr w:type="spellEnd"/>
-    </w:p>
-    <w:p>
-      <w:pPr>
-        <w:tabs>
-          <w:tab w:val="left" w:pos="1804"/>
-        </w:tabs>
-        <w:rPr>
-          <w:sz w:val="28"/>
-          <w:szCs w:val="28"/>
-        </w:rPr>
-      </w:pPr>
-    </w:p>
-    <w:p>
-      <w:pPr>
-        <w:tabs>
-          <w:tab w:val="left" w:pos="1804"/>
-        </w:tabs>
-        <w:rPr>
-          <w:sz w:val="28"/>
-          <w:szCs w:val="28"/>
-        </w:rPr>
-      </w:pPr>
-      <w:r>
-        <w:rPr>
-          <w:sz w:val="28"/>
-          <w:szCs w:val="28"/>
-        </w:rPr>
-        <w:t>=========</w:t>
-      </w:r>
-      <w:proofErr w:type="spellStart"/>
-      <w:r>
-        <w:rPr>
-          <w:color w:val="C00000"/>
-          <w:sz w:val="28"/>
-          <w:szCs w:val="28"/>
-        </w:rPr>
-        <w:t>Xpath</w:t>
-      </w:r>
-      <w:proofErr w:type="spellEnd"/>
       <w:r>
         <w:rPr>
           <w:color w:val="C00000"/>
@@ -1372,21 +1226,12 @@
           <w:szCs w:val="28"/>
         </w:rPr>
       </w:pPr>
-      <w:proofErr w:type="gramStart"/>
-      <w:r>
-        <w:rPr>
-          <w:sz w:val="28"/>
-          <w:szCs w:val="28"/>
-        </w:rPr>
-        <w:t>Text(</w:t>
-      </w:r>
-      <w:proofErr w:type="gramEnd"/>
-      <w:r>
-        <w:rPr>
-          <w:sz w:val="28"/>
-          <w:szCs w:val="28"/>
-        </w:rPr>
-        <w:t>)</w:t>
+      <w:r>
+        <w:rPr>
+          <w:sz w:val="28"/>
+          <w:szCs w:val="28"/>
+        </w:rPr>
+        <w:t>Text()</w:t>
       </w:r>
     </w:p>
     <w:p>
@@ -1402,21 +1247,12 @@
           <w:szCs w:val="28"/>
         </w:rPr>
       </w:pPr>
-      <w:proofErr w:type="gramStart"/>
-      <w:r>
-        <w:rPr>
-          <w:sz w:val="28"/>
-          <w:szCs w:val="28"/>
-        </w:rPr>
-        <w:t>Contains(</w:t>
-      </w:r>
-      <w:proofErr w:type="gramEnd"/>
-      <w:r>
-        <w:rPr>
-          <w:sz w:val="28"/>
-          <w:szCs w:val="28"/>
-        </w:rPr>
-        <w:t>)</w:t>
+      <w:r>
+        <w:rPr>
+          <w:sz w:val="28"/>
+          <w:szCs w:val="28"/>
+        </w:rPr>
+        <w:t>Contains()</w:t>
       </w:r>
     </w:p>
     <w:p>
@@ -1437,23 +1273,7 @@
           <w:sz w:val="28"/>
           <w:szCs w:val="28"/>
         </w:rPr>
-        <w:t>Normalize-</w:t>
-      </w:r>
-      <w:proofErr w:type="gramStart"/>
-      <w:r>
-        <w:rPr>
-          <w:sz w:val="28"/>
-          <w:szCs w:val="28"/>
-        </w:rPr>
-        <w:t>space(</w:t>
-      </w:r>
-      <w:proofErr w:type="gramEnd"/>
-      <w:r>
-        <w:rPr>
-          <w:sz w:val="28"/>
-          <w:szCs w:val="28"/>
-        </w:rPr>
-        <w:t>)</w:t>
+        <w:t>Normalize-space()</w:t>
       </w:r>
     </w:p>
     <w:p>
@@ -1469,21 +1289,12 @@
           <w:szCs w:val="28"/>
         </w:rPr>
       </w:pPr>
-      <w:proofErr w:type="gramStart"/>
-      <w:r>
-        <w:rPr>
-          <w:sz w:val="28"/>
-          <w:szCs w:val="28"/>
-        </w:rPr>
-        <w:t>Last(</w:t>
-      </w:r>
-      <w:proofErr w:type="gramEnd"/>
-      <w:r>
-        <w:rPr>
-          <w:sz w:val="28"/>
-          <w:szCs w:val="28"/>
-        </w:rPr>
-        <w:t xml:space="preserve">)  </w:t>
+      <w:r>
+        <w:rPr>
+          <w:sz w:val="28"/>
+          <w:szCs w:val="28"/>
+        </w:rPr>
+        <w:t xml:space="preserve">Last()  </w:t>
       </w:r>
     </w:p>
     <w:p>
@@ -1624,7 +1435,7 @@
           <w:lang w:eastAsia="en-IN"/>
         </w:rPr>
         <w:drawing>
-          <wp:inline distT="0" distB="0" distL="0" distR="0">
+          <wp:inline distT="0" distB="0" distL="0" distR="0" wp14:anchorId="028DDD97" wp14:editId="177A8BCD">
             <wp:extent cx="5727065" cy="2795270"/>
             <wp:effectExtent l="0" t="0" r="6985" b="5080"/>
             <wp:docPr id="400" name="Picture 400"/>
@@ -1802,7 +1613,6 @@
         <w:t>-</w:t>
       </w:r>
       <w:proofErr w:type="spellStart"/>
-      <w:proofErr w:type="gramStart"/>
       <w:r>
         <w:rPr>
           <w:sz w:val="28"/>
@@ -1823,15 +1633,7 @@
           <w:sz w:val="28"/>
           <w:szCs w:val="28"/>
         </w:rPr>
-        <w:t xml:space="preserve"> ,</w:t>
-      </w:r>
-      <w:proofErr w:type="gramEnd"/>
-      <w:r>
-        <w:rPr>
-          <w:sz w:val="28"/>
-          <w:szCs w:val="28"/>
-        </w:rPr>
-        <w:t xml:space="preserve"> followed by / is called absolute </w:t>
+        <w:t xml:space="preserve"> , followed by / is called absolute </w:t>
       </w:r>
       <w:proofErr w:type="spellStart"/>
       <w:r>
@@ -1969,23 +1771,7 @@
           <w:sz w:val="28"/>
           <w:szCs w:val="28"/>
         </w:rPr>
-        <w:t xml:space="preserve"> should not be used in real time selenium </w:t>
-      </w:r>
-      <w:proofErr w:type="gramStart"/>
-      <w:r>
-        <w:rPr>
-          <w:sz w:val="28"/>
-          <w:szCs w:val="28"/>
-        </w:rPr>
-        <w:t>test ,</w:t>
-      </w:r>
-      <w:proofErr w:type="gramEnd"/>
-      <w:r>
-        <w:rPr>
-          <w:sz w:val="28"/>
-          <w:szCs w:val="28"/>
-        </w:rPr>
-        <w:t xml:space="preserve"> because it fail</w:t>
+        <w:t xml:space="preserve"> should not be used in real time selenium test , because it fail</w:t>
       </w:r>
       <w:r>
         <w:rPr>
@@ -2080,7 +1866,6 @@
           <w:szCs w:val="36"/>
         </w:rPr>
       </w:pPr>
-      <w:proofErr w:type="gramStart"/>
       <w:r>
         <w:rPr>
           <w:rFonts w:ascii="Courier New" w:hAnsi="Courier New" w:cs="Courier New"/>
@@ -2088,17 +1873,7 @@
           <w:sz w:val="36"/>
           <w:szCs w:val="36"/>
         </w:rPr>
-        <w:t>//html/body/input[</w:t>
-      </w:r>
-      <w:proofErr w:type="gramEnd"/>
-      <w:r>
-        <w:rPr>
-          <w:rFonts w:ascii="Courier New" w:hAnsi="Courier New" w:cs="Courier New"/>
-          <w:color w:val="2A00FF"/>
-          <w:sz w:val="36"/>
-          <w:szCs w:val="36"/>
-        </w:rPr>
-        <w:t>1]</w:t>
+        <w:t>//html/body/input[1]</w:t>
       </w:r>
     </w:p>
     <w:p>
@@ -2115,7 +1890,6 @@
           <w:szCs w:val="16"/>
         </w:rPr>
       </w:pPr>
-      <w:proofErr w:type="gramStart"/>
       <w:r>
         <w:rPr>
           <w:rFonts w:ascii="Courier New" w:hAnsi="Courier New" w:cs="Courier New"/>
@@ -2123,17 +1897,7 @@
           <w:sz w:val="16"/>
           <w:szCs w:val="16"/>
         </w:rPr>
-        <w:t>//html/body/input[</w:t>
-      </w:r>
-      <w:proofErr w:type="gramEnd"/>
-      <w:r>
-        <w:rPr>
-          <w:rFonts w:ascii="Courier New" w:hAnsi="Courier New" w:cs="Courier New"/>
-          <w:color w:val="2A00FF"/>
-          <w:sz w:val="16"/>
-          <w:szCs w:val="16"/>
-        </w:rPr>
-        <w:t>2]</w:t>
+        <w:t>//html/body/input[2]</w:t>
       </w:r>
     </w:p>
     <w:p>
@@ -2196,7 +1960,6 @@
         <w:t xml:space="preserve"> </w:t>
       </w:r>
       <w:proofErr w:type="spellStart"/>
-      <w:proofErr w:type="gramStart"/>
       <w:r>
         <w:rPr>
           <w:rFonts w:ascii="Courier New" w:hAnsi="Courier New" w:cs="Courier New"/>
@@ -2214,9 +1977,21 @@
           <w:sz w:val="16"/>
           <w:szCs w:val="16"/>
         </w:rPr>
-        <w:t>(</w:t>
-      </w:r>
-      <w:proofErr w:type="gramEnd"/>
+        <w:t>();</w:t>
+      </w:r>
+    </w:p>
+    <w:p>
+      <w:pPr>
+        <w:autoSpaceDE w:val="0"/>
+        <w:autoSpaceDN w:val="0"/>
+        <w:adjustRightInd w:val="0"/>
+        <w:spacing w:after="0" w:line="240" w:lineRule="auto"/>
+        <w:rPr>
+          <w:rFonts w:ascii="Courier New" w:hAnsi="Courier New" w:cs="Courier New"/>
+          <w:sz w:val="16"/>
+          <w:szCs w:val="16"/>
+        </w:rPr>
+      </w:pPr>
       <w:r>
         <w:rPr>
           <w:rFonts w:ascii="Courier New" w:hAnsi="Courier New" w:cs="Courier New"/>
@@ -2224,6 +1999,73 @@
           <w:sz w:val="16"/>
           <w:szCs w:val="16"/>
         </w:rPr>
+        <w:t xml:space="preserve">     </w:t>
+      </w:r>
+      <w:proofErr w:type="spellStart"/>
+      <w:r>
+        <w:rPr>
+          <w:rFonts w:ascii="Courier New" w:hAnsi="Courier New" w:cs="Courier New"/>
+          <w:color w:val="6A3E3E"/>
+          <w:sz w:val="16"/>
+          <w:szCs w:val="16"/>
+        </w:rPr>
+        <w:t>driver</w:t>
+      </w:r>
+      <w:r>
+        <w:rPr>
+          <w:rFonts w:ascii="Courier New" w:hAnsi="Courier New" w:cs="Courier New"/>
+          <w:color w:val="000000"/>
+          <w:sz w:val="16"/>
+          <w:szCs w:val="16"/>
+        </w:rPr>
+        <w:t>.get</w:t>
+      </w:r>
+      <w:proofErr w:type="spellEnd"/>
+      <w:r>
+        <w:rPr>
+          <w:rFonts w:ascii="Courier New" w:hAnsi="Courier New" w:cs="Courier New"/>
+          <w:color w:val="000000"/>
+          <w:sz w:val="16"/>
+          <w:szCs w:val="16"/>
+        </w:rPr>
+        <w:t>(</w:t>
+      </w:r>
+      <w:r>
+        <w:rPr>
+          <w:rFonts w:ascii="Courier New" w:hAnsi="Courier New" w:cs="Courier New"/>
+          <w:color w:val="2A00FF"/>
+          <w:sz w:val="16"/>
+          <w:szCs w:val="16"/>
+        </w:rPr>
+        <w:t>"file:///C:/Users/</w:t>
+      </w:r>
+      <w:proofErr w:type="spellStart"/>
+      <w:r>
+        <w:rPr>
+          <w:rFonts w:ascii="Courier New" w:hAnsi="Courier New" w:cs="Courier New"/>
+          <w:color w:val="2A00FF"/>
+          <w:sz w:val="16"/>
+          <w:szCs w:val="16"/>
+        </w:rPr>
+        <w:t>Raveesh</w:t>
+      </w:r>
+      <w:proofErr w:type="spellEnd"/>
+      <w:r>
+        <w:rPr>
+          <w:rFonts w:ascii="Courier New" w:hAnsi="Courier New" w:cs="Courier New"/>
+          <w:color w:val="2A00FF"/>
+          <w:sz w:val="16"/>
+          <w:szCs w:val="16"/>
+        </w:rPr>
+        <w:t>/Desktop/myPage.html"</w:t>
+      </w:r>
+      <w:r>
+        <w:rPr>
+          <w:rFonts w:ascii="Courier New" w:hAnsi="Courier New" w:cs="Courier New"/>
+          <w:color w:val="000000"/>
+          <w:sz w:val="16"/>
+          <w:szCs w:val="16"/>
+        </w:rPr>
         <w:t>);</w:t>
       </w:r>
     </w:p>
@@ -2248,7 +2090,28 @@
         </w:rPr>
         <w:t xml:space="preserve">     </w:t>
       </w:r>
-      <w:proofErr w:type="spellStart"/>
+    </w:p>
+    <w:p>
+      <w:pPr>
+        <w:autoSpaceDE w:val="0"/>
+        <w:autoSpaceDN w:val="0"/>
+        <w:adjustRightInd w:val="0"/>
+        <w:spacing w:after="0" w:line="240" w:lineRule="auto"/>
+        <w:rPr>
+          <w:rFonts w:ascii="Courier New" w:hAnsi="Courier New" w:cs="Courier New"/>
+          <w:sz w:val="16"/>
+          <w:szCs w:val="16"/>
+        </w:rPr>
+      </w:pPr>
+      <w:r>
+        <w:rPr>
+          <w:rFonts w:ascii="Courier New" w:hAnsi="Courier New" w:cs="Courier New"/>
+          <w:color w:val="000000"/>
+          <w:sz w:val="16"/>
+          <w:szCs w:val="16"/>
+        </w:rPr>
+        <w:t xml:space="preserve">     </w:t>
+      </w:r>
       <w:r>
         <w:rPr>
           <w:rFonts w:ascii="Courier New" w:hAnsi="Courier New" w:cs="Courier New"/>
@@ -2265,108 +2128,7 @@
           <w:sz w:val="16"/>
           <w:szCs w:val="16"/>
         </w:rPr>
-        <w:t>.get</w:t>
-      </w:r>
-      <w:proofErr w:type="spellEnd"/>
-      <w:r>
-        <w:rPr>
-          <w:rFonts w:ascii="Courier New" w:hAnsi="Courier New" w:cs="Courier New"/>
-          <w:color w:val="000000"/>
-          <w:sz w:val="16"/>
-          <w:szCs w:val="16"/>
-        </w:rPr>
-        <w:t>(</w:t>
-      </w:r>
-      <w:r>
-        <w:rPr>
-          <w:rFonts w:ascii="Courier New" w:hAnsi="Courier New" w:cs="Courier New"/>
-          <w:color w:val="2A00FF"/>
-          <w:sz w:val="16"/>
-          <w:szCs w:val="16"/>
-        </w:rPr>
-        <w:t>"file:///C:/Users/Raveesh/Desktop/myPage.html"</w:t>
-      </w:r>
-      <w:r>
-        <w:rPr>
-          <w:rFonts w:ascii="Courier New" w:hAnsi="Courier New" w:cs="Courier New"/>
-          <w:color w:val="000000"/>
-          <w:sz w:val="16"/>
-          <w:szCs w:val="16"/>
-        </w:rPr>
-        <w:t>);</w:t>
-      </w:r>
-    </w:p>
-    <w:p>
-      <w:pPr>
-        <w:autoSpaceDE w:val="0"/>
-        <w:autoSpaceDN w:val="0"/>
-        <w:adjustRightInd w:val="0"/>
-        <w:spacing w:after="0" w:line="240" w:lineRule="auto"/>
-        <w:rPr>
-          <w:rFonts w:ascii="Courier New" w:hAnsi="Courier New" w:cs="Courier New"/>
-          <w:sz w:val="16"/>
-          <w:szCs w:val="16"/>
-        </w:rPr>
-      </w:pPr>
-      <w:r>
-        <w:rPr>
-          <w:rFonts w:ascii="Courier New" w:hAnsi="Courier New" w:cs="Courier New"/>
-          <w:color w:val="000000"/>
-          <w:sz w:val="16"/>
-          <w:szCs w:val="16"/>
-        </w:rPr>
-        <w:t xml:space="preserve">     </w:t>
-      </w:r>
-    </w:p>
-    <w:p>
-      <w:pPr>
-        <w:autoSpaceDE w:val="0"/>
-        <w:autoSpaceDN w:val="0"/>
-        <w:adjustRightInd w:val="0"/>
-        <w:spacing w:after="0" w:line="240" w:lineRule="auto"/>
-        <w:rPr>
-          <w:rFonts w:ascii="Courier New" w:hAnsi="Courier New" w:cs="Courier New"/>
-          <w:sz w:val="16"/>
-          <w:szCs w:val="16"/>
-        </w:rPr>
-      </w:pPr>
-      <w:r>
-        <w:rPr>
-          <w:rFonts w:ascii="Courier New" w:hAnsi="Courier New" w:cs="Courier New"/>
-          <w:color w:val="000000"/>
-          <w:sz w:val="16"/>
-          <w:szCs w:val="16"/>
-        </w:rPr>
-        <w:t xml:space="preserve">     </w:t>
-      </w:r>
-      <w:proofErr w:type="gramStart"/>
-      <w:r>
-        <w:rPr>
-          <w:rFonts w:ascii="Courier New" w:hAnsi="Courier New" w:cs="Courier New"/>
-          <w:color w:val="6A3E3E"/>
-          <w:sz w:val="16"/>
-          <w:szCs w:val="16"/>
-        </w:rPr>
-        <w:t>driver</w:t>
-      </w:r>
-      <w:r>
-        <w:rPr>
-          <w:rFonts w:ascii="Courier New" w:hAnsi="Courier New" w:cs="Courier New"/>
-          <w:color w:val="000000"/>
-          <w:sz w:val="16"/>
-          <w:szCs w:val="16"/>
-        </w:rPr>
-        <w:t>.findElement</w:t>
-      </w:r>
-      <w:proofErr w:type="gramEnd"/>
-      <w:r>
-        <w:rPr>
-          <w:rFonts w:ascii="Courier New" w:hAnsi="Courier New" w:cs="Courier New"/>
-          <w:color w:val="000000"/>
-          <w:sz w:val="16"/>
-          <w:szCs w:val="16"/>
-        </w:rPr>
-        <w:t>(By.</w:t>
+        <w:t>.findElement(By.</w:t>
       </w:r>
       <w:r>
         <w:rPr>
@@ -2446,7 +2208,6 @@
         </w:rPr>
         <w:t xml:space="preserve">     </w:t>
       </w:r>
-      <w:proofErr w:type="gramStart"/>
       <w:r>
         <w:rPr>
           <w:rFonts w:ascii="Courier New" w:hAnsi="Courier New" w:cs="Courier New"/>
@@ -2463,17 +2224,7 @@
           <w:sz w:val="16"/>
           <w:szCs w:val="16"/>
         </w:rPr>
-        <w:t>.findElement</w:t>
-      </w:r>
-      <w:proofErr w:type="gramEnd"/>
-      <w:r>
-        <w:rPr>
-          <w:rFonts w:ascii="Courier New" w:hAnsi="Courier New" w:cs="Courier New"/>
-          <w:color w:val="000000"/>
-          <w:sz w:val="16"/>
-          <w:szCs w:val="16"/>
-        </w:rPr>
-        <w:t>(By.</w:t>
+        <w:t>.findElement(By.</w:t>
       </w:r>
       <w:r>
         <w:rPr>
@@ -2555,7 +2306,6 @@
         <w:t xml:space="preserve">     </w:t>
       </w:r>
       <w:proofErr w:type="spellStart"/>
-      <w:proofErr w:type="gramStart"/>
       <w:r>
         <w:rPr>
           <w:rFonts w:ascii="Courier New" w:hAnsi="Courier New" w:cs="Courier New"/>
@@ -2575,7 +2325,6 @@
         <w:t>.findElement</w:t>
       </w:r>
       <w:proofErr w:type="spellEnd"/>
-      <w:proofErr w:type="gramEnd"/>
       <w:r>
         <w:rPr>
           <w:rFonts w:ascii="Courier New" w:hAnsi="Courier New" w:cs="Courier New"/>
@@ -2715,7 +2464,7 @@
           <w:lang w:eastAsia="en-IN"/>
         </w:rPr>
         <w:drawing>
-          <wp:inline distT="0" distB="0" distL="0" distR="0">
+          <wp:inline distT="0" distB="0" distL="0" distR="0" wp14:anchorId="5351F5D1" wp14:editId="6CC1319D">
             <wp:extent cx="5721985" cy="3458210"/>
             <wp:effectExtent l="0" t="0" r="0" b="8890"/>
             <wp:docPr id="30" name="Picture 30"/>
@@ -2912,23 +2661,7 @@
           <w:sz w:val="32"/>
           <w:szCs w:val="32"/>
         </w:rPr>
-        <w:t xml:space="preserve">or visible </w:t>
-      </w:r>
-      <w:proofErr w:type="gramStart"/>
-      <w:r>
-        <w:rPr>
-          <w:sz w:val="32"/>
-          <w:szCs w:val="32"/>
-        </w:rPr>
-        <w:t>text  is</w:t>
-      </w:r>
-      <w:proofErr w:type="gramEnd"/>
-      <w:r>
-        <w:rPr>
-          <w:sz w:val="32"/>
-          <w:szCs w:val="32"/>
-        </w:rPr>
-        <w:t xml:space="preserve"> called relative </w:t>
+        <w:t xml:space="preserve">or visible text  is called relative </w:t>
       </w:r>
       <w:proofErr w:type="spellStart"/>
       <w:r>
@@ -3000,23 +2733,7 @@
           <w:sz w:val="32"/>
           <w:szCs w:val="32"/>
         </w:rPr>
-        <w:t xml:space="preserve">Because of Agile </w:t>
-      </w:r>
-      <w:proofErr w:type="gramStart"/>
-      <w:r>
-        <w:rPr>
-          <w:sz w:val="32"/>
-          <w:szCs w:val="32"/>
-        </w:rPr>
-        <w:t>Methodology  better</w:t>
-      </w:r>
-      <w:proofErr w:type="gramEnd"/>
-      <w:r>
-        <w:rPr>
-          <w:sz w:val="32"/>
-          <w:szCs w:val="32"/>
-        </w:rPr>
-        <w:t xml:space="preserve"> to go for relative </w:t>
+        <w:t xml:space="preserve">Because of Agile Methodology  better to go for relative </w:t>
       </w:r>
       <w:proofErr w:type="spellStart"/>
       <w:r>
@@ -3407,33 +3124,15 @@
           <w:sz w:val="32"/>
           <w:szCs w:val="32"/>
         </w:rPr>
-        <w:t xml:space="preserve">Case </w:t>
-      </w:r>
-      <w:proofErr w:type="gramStart"/>
-      <w:r>
-        <w:rPr>
-          <w:color w:val="C00000"/>
-          <w:sz w:val="32"/>
-          <w:szCs w:val="32"/>
-        </w:rPr>
-        <w:t xml:space="preserve">2 </w:t>
-      </w:r>
-      <w:r>
-        <w:rPr>
-          <w:color w:val="C00000"/>
-          <w:sz w:val="32"/>
-          <w:szCs w:val="32"/>
-        </w:rPr>
-        <w:t>:</w:t>
-      </w:r>
-      <w:proofErr w:type="gramEnd"/>
-      <w:r>
-        <w:rPr>
-          <w:color w:val="C00000"/>
-          <w:sz w:val="32"/>
-          <w:szCs w:val="32"/>
-        </w:rPr>
-        <w:t xml:space="preserve">  how to identify the object using multiple attributes</w:t>
+        <w:t xml:space="preserve">Case 2 </w:t>
+      </w:r>
+      <w:r>
+        <w:rPr>
+          <w:color w:val="C00000"/>
+          <w:sz w:val="32"/>
+          <w:szCs w:val="32"/>
+        </w:rPr>
+        <w:t>:  how to identify the object using multiple attributes</w:t>
       </w:r>
     </w:p>
     <w:p>
@@ -3454,7 +3153,6 @@
         <w:t>//</w:t>
       </w:r>
       <w:proofErr w:type="spellStart"/>
-      <w:proofErr w:type="gramStart"/>
       <w:r>
         <w:rPr>
           <w:sz w:val="32"/>
@@ -3468,65 +3166,25 @@
           <w:sz w:val="32"/>
           <w:szCs w:val="32"/>
         </w:rPr>
-        <w:t>[</w:t>
-      </w:r>
-      <w:proofErr w:type="gramEnd"/>
-      <w:r>
-        <w:rPr>
-          <w:sz w:val="32"/>
-          <w:szCs w:val="32"/>
-        </w:rPr>
-        <w:t>@attribute1=’value’ and @attribute2=’value’]</w:t>
-      </w:r>
-    </w:p>
-    <w:p>
-      <w:pPr>
-        <w:tabs>
-          <w:tab w:val="left" w:pos="1804"/>
-        </w:tabs>
-        <w:rPr>
-          <w:sz w:val="32"/>
-          <w:szCs w:val="32"/>
-        </w:rPr>
-      </w:pPr>
-      <w:r>
-        <w:rPr>
-          <w:sz w:val="32"/>
-          <w:szCs w:val="32"/>
-        </w:rPr>
-        <w:t>//</w:t>
-      </w:r>
-      <w:proofErr w:type="gramStart"/>
-      <w:r>
-        <w:rPr>
-          <w:sz w:val="32"/>
-          <w:szCs w:val="32"/>
-        </w:rPr>
-        <w:t>input[</w:t>
-      </w:r>
-      <w:proofErr w:type="gramEnd"/>
-      <w:r>
-        <w:rPr>
-          <w:sz w:val="32"/>
-          <w:szCs w:val="32"/>
-        </w:rPr>
-        <w:t>@name='</w:t>
-      </w:r>
-      <w:proofErr w:type="spellStart"/>
-      <w:r>
-        <w:rPr>
-          <w:sz w:val="32"/>
-          <w:szCs w:val="32"/>
-        </w:rPr>
-        <w:t>ck</w:t>
-      </w:r>
-      <w:proofErr w:type="spellEnd"/>
-      <w:r>
-        <w:rPr>
-          <w:sz w:val="32"/>
-          <w:szCs w:val="32"/>
-        </w:rPr>
-        <w:t>' and @type='checkbox']</w:t>
+        <w:t>[@attribute1=’value’ and @attribute2=’value’]</w:t>
+      </w:r>
+    </w:p>
+    <w:p>
+      <w:pPr>
+        <w:tabs>
+          <w:tab w:val="left" w:pos="1804"/>
+        </w:tabs>
+        <w:rPr>
+          <w:sz w:val="32"/>
+          <w:szCs w:val="32"/>
+        </w:rPr>
+      </w:pPr>
+      <w:r>
+        <w:rPr>
+          <w:sz w:val="32"/>
+          <w:szCs w:val="32"/>
+        </w:rPr>
+        <w:t>//input[@name='ck' and @type='checkbox']</w:t>
       </w:r>
     </w:p>
     <w:p>
@@ -3568,23 +3226,7 @@
           <w:sz w:val="32"/>
           <w:szCs w:val="32"/>
         </w:rPr>
-        <w:t xml:space="preserve"> </w:t>
-      </w:r>
-      <w:proofErr w:type="gramStart"/>
-      <w:r>
-        <w:rPr>
-          <w:sz w:val="32"/>
-          <w:szCs w:val="32"/>
-        </w:rPr>
-        <w:t>attribute ,</w:t>
-      </w:r>
-      <w:proofErr w:type="gramEnd"/>
-      <w:r>
-        <w:rPr>
-          <w:sz w:val="32"/>
-          <w:szCs w:val="32"/>
-        </w:rPr>
-        <w:t xml:space="preserve"> we can go for multiple attribute using and keyword</w:t>
+        <w:t xml:space="preserve"> attribute , we can go for multiple attribute using and keyword</w:t>
       </w:r>
     </w:p>
     <w:p>
@@ -3673,33 +3315,15 @@
           <w:sz w:val="32"/>
           <w:szCs w:val="32"/>
         </w:rPr>
-        <w:t xml:space="preserve">Case </w:t>
-      </w:r>
-      <w:proofErr w:type="gramStart"/>
-      <w:r>
-        <w:rPr>
-          <w:color w:val="C00000"/>
-          <w:sz w:val="32"/>
-          <w:szCs w:val="32"/>
-        </w:rPr>
-        <w:t xml:space="preserve">3 </w:t>
-      </w:r>
-      <w:r>
-        <w:rPr>
-          <w:color w:val="C00000"/>
-          <w:sz w:val="32"/>
-          <w:szCs w:val="32"/>
-        </w:rPr>
-        <w:t>:</w:t>
-      </w:r>
-      <w:proofErr w:type="gramEnd"/>
-      <w:r>
-        <w:rPr>
-          <w:color w:val="C00000"/>
-          <w:sz w:val="32"/>
-          <w:szCs w:val="32"/>
-        </w:rPr>
-        <w:t xml:space="preserve">  how to </w:t>
+        <w:t xml:space="preserve">Case 3 </w:t>
+      </w:r>
+      <w:r>
+        <w:rPr>
+          <w:color w:val="C00000"/>
+          <w:sz w:val="32"/>
+          <w:szCs w:val="32"/>
+        </w:rPr>
+        <w:t xml:space="preserve">:  how to </w:t>
       </w:r>
       <w:proofErr w:type="spellStart"/>
       <w:r>
@@ -3901,21 +3525,12 @@
           <w:szCs w:val="32"/>
         </w:rPr>
       </w:pPr>
-      <w:proofErr w:type="gramStart"/>
-      <w:r>
-        <w:rPr>
-          <w:sz w:val="32"/>
-          <w:szCs w:val="32"/>
-        </w:rPr>
-        <w:t>Text(</w:t>
-      </w:r>
-      <w:proofErr w:type="gramEnd"/>
-      <w:r>
-        <w:rPr>
-          <w:sz w:val="32"/>
-          <w:szCs w:val="32"/>
-        </w:rPr>
-        <w:t>)=’expected Value’</w:t>
+      <w:r>
+        <w:rPr>
+          <w:sz w:val="32"/>
+          <w:szCs w:val="32"/>
+        </w:rPr>
+        <w:t>Text()=’expected Value’</w:t>
       </w:r>
     </w:p>
     <w:p>
@@ -3949,23 +3564,7 @@
           <w:sz w:val="32"/>
           <w:szCs w:val="32"/>
         </w:rPr>
-        <w:t>[</w:t>
-      </w:r>
-      <w:proofErr w:type="gramStart"/>
-      <w:r>
-        <w:rPr>
-          <w:sz w:val="32"/>
-          <w:szCs w:val="32"/>
-        </w:rPr>
-        <w:t>text(</w:t>
-      </w:r>
-      <w:proofErr w:type="gramEnd"/>
-      <w:r>
-        <w:rPr>
-          <w:sz w:val="32"/>
-          <w:szCs w:val="32"/>
-        </w:rPr>
-        <w:t>)=’Expected value’]</w:t>
+        <w:t>[text()=’Expected value’]</w:t>
       </w:r>
     </w:p>
     <w:p>
@@ -3986,7 +3585,7 @@
           <w:lang w:eastAsia="en-IN"/>
         </w:rPr>
         <w:drawing>
-          <wp:inline distT="0" distB="0" distL="0" distR="0">
+          <wp:inline distT="0" distB="0" distL="0" distR="0" wp14:anchorId="3F3CDF1C" wp14:editId="1D48142F">
             <wp:extent cx="5727700" cy="2063115"/>
             <wp:effectExtent l="0" t="0" r="6350" b="0"/>
             <wp:docPr id="31" name="Picture 31"/>
@@ -4056,124 +3655,67 @@
           <w:szCs w:val="32"/>
         </w:rPr>
       </w:pPr>
-      <w:proofErr w:type="gramStart"/>
       <w:r>
         <w:rPr>
           <w:sz w:val="32"/>
           <w:szCs w:val="32"/>
         </w:rPr>
         <w:lastRenderedPageBreak/>
-        <w:t>EG :</w:t>
-      </w:r>
-      <w:proofErr w:type="gramEnd"/>
-      <w:r>
-        <w:rPr>
-          <w:sz w:val="32"/>
-          <w:szCs w:val="32"/>
-        </w:rPr>
-        <w:t xml:space="preserve"> </w:t>
-      </w:r>
-    </w:p>
-    <w:p>
-      <w:pPr>
-        <w:tabs>
-          <w:tab w:val="left" w:pos="1804"/>
-        </w:tabs>
-        <w:rPr>
-          <w:sz w:val="32"/>
-          <w:szCs w:val="32"/>
-        </w:rPr>
-      </w:pPr>
-      <w:r>
-        <w:rPr>
-          <w:sz w:val="32"/>
-          <w:szCs w:val="32"/>
-        </w:rPr>
-        <w:t>//h1[</w:t>
-      </w:r>
-      <w:proofErr w:type="gramStart"/>
-      <w:r>
-        <w:rPr>
-          <w:sz w:val="32"/>
-          <w:szCs w:val="32"/>
-        </w:rPr>
-        <w:t>text(</w:t>
-      </w:r>
-      <w:proofErr w:type="gramEnd"/>
-      <w:r>
-        <w:rPr>
-          <w:sz w:val="32"/>
-          <w:szCs w:val="32"/>
-        </w:rPr>
-        <w:t>)='welcome to amazon']                  :correct</w:t>
-      </w:r>
-    </w:p>
-    <w:p>
-      <w:pPr>
-        <w:tabs>
-          <w:tab w:val="left" w:pos="1804"/>
-        </w:tabs>
-        <w:rPr>
-          <w:sz w:val="32"/>
-          <w:szCs w:val="32"/>
-        </w:rPr>
-      </w:pPr>
-      <w:r>
-        <w:rPr>
-          <w:sz w:val="32"/>
-          <w:szCs w:val="32"/>
-        </w:rPr>
-        <w:t>//h1[</w:t>
-      </w:r>
-      <w:proofErr w:type="gramStart"/>
-      <w:r>
-        <w:rPr>
-          <w:sz w:val="32"/>
-          <w:szCs w:val="32"/>
-        </w:rPr>
-        <w:t>text(</w:t>
-      </w:r>
-      <w:proofErr w:type="gramEnd"/>
-      <w:r>
-        <w:rPr>
-          <w:sz w:val="32"/>
-          <w:szCs w:val="32"/>
-        </w:rPr>
-        <w:t xml:space="preserve">)='we have 1.1 million users']         : Wrong </w:t>
-      </w:r>
-    </w:p>
-    <w:p>
-      <w:pPr>
-        <w:tabs>
-          <w:tab w:val="left" w:pos="1804"/>
-        </w:tabs>
-        <w:rPr>
-          <w:sz w:val="32"/>
-          <w:szCs w:val="32"/>
-        </w:rPr>
-      </w:pPr>
-      <w:r>
-        <w:rPr>
-          <w:sz w:val="32"/>
-          <w:szCs w:val="32"/>
-        </w:rPr>
-        <w:t>//h1[</w:t>
-      </w:r>
-      <w:proofErr w:type="gramStart"/>
-      <w:r>
-        <w:rPr>
-          <w:sz w:val="32"/>
-          <w:szCs w:val="32"/>
-        </w:rPr>
-        <w:t>text(</w:t>
-      </w:r>
-      <w:proofErr w:type="gramEnd"/>
-      <w:r>
-        <w:rPr>
-          <w:sz w:val="32"/>
-          <w:szCs w:val="32"/>
-        </w:rPr>
-        <w:t xml:space="preserve">)='we </w:t>
+        <w:t xml:space="preserve">EG : </w:t>
+      </w:r>
+    </w:p>
+    <w:p>
+      <w:pPr>
+        <w:tabs>
+          <w:tab w:val="left" w:pos="1804"/>
+        </w:tabs>
+        <w:rPr>
+          <w:sz w:val="32"/>
+          <w:szCs w:val="32"/>
+        </w:rPr>
+      </w:pPr>
+      <w:r>
+        <w:rPr>
+          <w:sz w:val="32"/>
+          <w:szCs w:val="32"/>
+        </w:rPr>
+        <w:t>//h1[text()='welcome to amazon']                  :correct</w:t>
+      </w:r>
+    </w:p>
+    <w:p>
+      <w:pPr>
+        <w:tabs>
+          <w:tab w:val="left" w:pos="1804"/>
+        </w:tabs>
+        <w:rPr>
+          <w:sz w:val="32"/>
+          <w:szCs w:val="32"/>
+        </w:rPr>
+      </w:pPr>
+      <w:r>
+        <w:rPr>
+          <w:sz w:val="32"/>
+          <w:szCs w:val="32"/>
+        </w:rPr>
+        <w:t xml:space="preserve">//h1[text()='we have 1.1 million users']         : Wrong </w:t>
+      </w:r>
+    </w:p>
+    <w:p>
+      <w:pPr>
+        <w:tabs>
+          <w:tab w:val="left" w:pos="1804"/>
+        </w:tabs>
+        <w:rPr>
+          <w:sz w:val="32"/>
+          <w:szCs w:val="32"/>
+        </w:rPr>
+      </w:pPr>
+      <w:r>
+        <w:rPr>
+          <w:sz w:val="32"/>
+          <w:szCs w:val="32"/>
+        </w:rPr>
+        <w:t xml:space="preserve">//h1[text()='we </w:t>
       </w:r>
       <w:proofErr w:type="spellStart"/>
       <w:r>
@@ -4207,23 +3749,7 @@
           <w:sz w:val="32"/>
           <w:szCs w:val="32"/>
         </w:rPr>
-        <w:t>//h1[</w:t>
-      </w:r>
-      <w:proofErr w:type="gramStart"/>
-      <w:r>
-        <w:rPr>
-          <w:sz w:val="32"/>
-          <w:szCs w:val="32"/>
-        </w:rPr>
-        <w:t>text(</w:t>
-      </w:r>
-      <w:proofErr w:type="gramEnd"/>
-      <w:r>
-        <w:rPr>
-          <w:sz w:val="32"/>
-          <w:szCs w:val="32"/>
-        </w:rPr>
-        <w:t>)='product list']                                  : wrong</w:t>
+        <w:t>//h1[text()='product list']                                  : wrong</w:t>
       </w:r>
     </w:p>
     <w:p>
@@ -4263,21 +3789,12 @@
           <w:szCs w:val="32"/>
         </w:rPr>
       </w:pPr>
-      <w:proofErr w:type="gramStart"/>
-      <w:r>
-        <w:rPr>
-          <w:sz w:val="32"/>
-          <w:szCs w:val="32"/>
-        </w:rPr>
-        <w:t>text(</w:t>
-      </w:r>
-      <w:proofErr w:type="gramEnd"/>
-      <w:r>
-        <w:rPr>
-          <w:sz w:val="32"/>
-          <w:szCs w:val="32"/>
-        </w:rPr>
-        <w:t>) is used to identify the object using visible text of the element</w:t>
+      <w:r>
+        <w:rPr>
+          <w:sz w:val="32"/>
+          <w:szCs w:val="32"/>
+        </w:rPr>
+        <w:t>text() is used to identify the object using visible text of the element</w:t>
       </w:r>
     </w:p>
     <w:p>
@@ -4295,21 +3812,12 @@
           <w:szCs w:val="32"/>
         </w:rPr>
       </w:pPr>
-      <w:proofErr w:type="gramStart"/>
-      <w:r>
-        <w:rPr>
-          <w:sz w:val="32"/>
-          <w:szCs w:val="32"/>
-        </w:rPr>
-        <w:t>text(</w:t>
-      </w:r>
-      <w:proofErr w:type="gramEnd"/>
-      <w:r>
-        <w:rPr>
-          <w:sz w:val="32"/>
-          <w:szCs w:val="32"/>
-        </w:rPr>
-        <w:t>) cannot identify dynamic text(the text which is changing dynamically)</w:t>
+      <w:r>
+        <w:rPr>
+          <w:sz w:val="32"/>
+          <w:szCs w:val="32"/>
+        </w:rPr>
+        <w:t>text() cannot identify dynamic text(the text which is changing dynamically)</w:t>
       </w:r>
     </w:p>
     <w:p>
@@ -4327,21 +3835,12 @@
           <w:szCs w:val="32"/>
         </w:rPr>
       </w:pPr>
-      <w:proofErr w:type="gramStart"/>
-      <w:r>
-        <w:rPr>
-          <w:sz w:val="32"/>
-          <w:szCs w:val="32"/>
-        </w:rPr>
-        <w:t>text(</w:t>
-      </w:r>
-      <w:proofErr w:type="gramEnd"/>
-      <w:r>
-        <w:rPr>
-          <w:sz w:val="32"/>
-          <w:szCs w:val="32"/>
-        </w:rPr>
-        <w:t>) cannot identify the object using part of the string , because its complete string matching function</w:t>
+      <w:r>
+        <w:rPr>
+          <w:sz w:val="32"/>
+          <w:szCs w:val="32"/>
+        </w:rPr>
+        <w:t>text() cannot identify the object using part of the string , because its complete string matching function</w:t>
       </w:r>
     </w:p>
     <w:p>
@@ -4382,21 +3881,12 @@
           <w:szCs w:val="32"/>
         </w:rPr>
       </w:pPr>
-      <w:proofErr w:type="gramStart"/>
-      <w:r>
-        <w:rPr>
-          <w:sz w:val="32"/>
-          <w:szCs w:val="32"/>
-        </w:rPr>
-        <w:t>text(</w:t>
-      </w:r>
-      <w:proofErr w:type="gramEnd"/>
-      <w:r>
-        <w:rPr>
-          <w:sz w:val="32"/>
-          <w:szCs w:val="32"/>
-        </w:rPr>
-        <w:t>) function navigate to html document &amp; try to identify expected visible text in GUI, &amp; return true if expected completely matches with UI text</w:t>
+      <w:r>
+        <w:rPr>
+          <w:sz w:val="32"/>
+          <w:szCs w:val="32"/>
+        </w:rPr>
+        <w:t>text() function navigate to html document &amp; try to identify expected visible text in GUI, &amp; return true if expected completely matches with UI text</w:t>
       </w:r>
     </w:p>
     <w:p>
@@ -4464,33 +3954,15 @@
           <w:sz w:val="32"/>
           <w:szCs w:val="32"/>
         </w:rPr>
-        <w:t xml:space="preserve">case </w:t>
-      </w:r>
-      <w:proofErr w:type="gramStart"/>
-      <w:r>
-        <w:rPr>
-          <w:color w:val="C00000"/>
-          <w:sz w:val="32"/>
-          <w:szCs w:val="32"/>
-        </w:rPr>
-        <w:t>4</w:t>
-      </w:r>
-      <w:r>
-        <w:rPr>
-          <w:color w:val="C00000"/>
-          <w:sz w:val="32"/>
-          <w:szCs w:val="32"/>
-        </w:rPr>
-        <w:t xml:space="preserve"> :</w:t>
-      </w:r>
-      <w:proofErr w:type="gramEnd"/>
-      <w:r>
-        <w:rPr>
-          <w:color w:val="C00000"/>
-          <w:sz w:val="32"/>
-          <w:szCs w:val="32"/>
-        </w:rPr>
-        <w:t xml:space="preserve"> how to identify dynamic object</w:t>
+        <w:t>case 4</w:t>
+      </w:r>
+      <w:r>
+        <w:rPr>
+          <w:color w:val="C00000"/>
+          <w:sz w:val="32"/>
+          <w:szCs w:val="32"/>
+        </w:rPr>
+        <w:t xml:space="preserve"> : how to identify dynamic object</w:t>
       </w:r>
     </w:p>
     <w:p>
@@ -4528,7 +4000,7 @@
         </w:rPr>
         <w:lastRenderedPageBreak/>
         <w:drawing>
-          <wp:inline distT="0" distB="0" distL="0" distR="0">
+          <wp:inline distT="0" distB="0" distL="0" distR="0" wp14:anchorId="713B0ED6" wp14:editId="01B517B0">
             <wp:extent cx="5725160" cy="4578985"/>
             <wp:effectExtent l="0" t="0" r="8890" b="0"/>
             <wp:docPr id="32" name="Picture 32"/>
@@ -4611,7 +4083,7 @@
           <w:lang w:eastAsia="en-IN"/>
         </w:rPr>
         <w:drawing>
-          <wp:inline distT="0" distB="0" distL="0" distR="0" wp14:anchorId="5C83925F" wp14:editId="2EAB9E97">
+          <wp:inline distT="0" distB="0" distL="0" distR="0" wp14:anchorId="1B5A7CA7" wp14:editId="796CD19B">
             <wp:extent cx="5563376" cy="3905795"/>
             <wp:effectExtent l="0" t="0" r="0" b="0"/>
             <wp:docPr id="1" name="Picture 1"/>
@@ -4687,23 +4159,99 @@
           <w:sz w:val="32"/>
           <w:szCs w:val="32"/>
         </w:rPr>
+        <w:t>contains(text()/@attribute, “expected value”)</w:t>
+      </w:r>
+    </w:p>
+    <w:p>
+      <w:pPr>
+        <w:pStyle w:val="ListParagraph"/>
+        <w:tabs>
+          <w:tab w:val="left" w:pos="1804"/>
+        </w:tabs>
+        <w:rPr>
+          <w:sz w:val="32"/>
+          <w:szCs w:val="32"/>
+        </w:rPr>
+      </w:pPr>
+    </w:p>
+    <w:p>
+      <w:pPr>
+        <w:pStyle w:val="ListParagraph"/>
+        <w:tabs>
+          <w:tab w:val="left" w:pos="1804"/>
+        </w:tabs>
+        <w:rPr>
+          <w:sz w:val="28"/>
+          <w:szCs w:val="28"/>
+        </w:rPr>
+      </w:pPr>
+      <w:r>
+        <w:rPr>
+          <w:sz w:val="28"/>
+          <w:szCs w:val="28"/>
+        </w:rPr>
+        <w:t>//</w:t>
+      </w:r>
+      <w:proofErr w:type="spellStart"/>
+      <w:r>
+        <w:rPr>
+          <w:sz w:val="28"/>
+          <w:szCs w:val="28"/>
+        </w:rPr>
+        <w:t>htmlTag</w:t>
+      </w:r>
+      <w:proofErr w:type="spellEnd"/>
+      <w:r>
+        <w:rPr>
+          <w:sz w:val="28"/>
+          <w:szCs w:val="28"/>
+        </w:rPr>
+        <w:t>[</w:t>
+      </w:r>
+      <w:r>
+        <w:rPr>
+          <w:color w:val="92D050"/>
+          <w:sz w:val="28"/>
+          <w:szCs w:val="28"/>
+        </w:rPr>
         <w:t>contains(</w:t>
       </w:r>
-      <w:proofErr w:type="gramStart"/>
-      <w:r>
-        <w:rPr>
-          <w:sz w:val="32"/>
-          <w:szCs w:val="32"/>
-        </w:rPr>
-        <w:t>text(</w:t>
-      </w:r>
-      <w:proofErr w:type="gramEnd"/>
-      <w:r>
-        <w:rPr>
-          <w:sz w:val="32"/>
-          <w:szCs w:val="32"/>
-        </w:rPr>
-        <w:t>)/@attribute, “expected value”)</w:t>
+      <w:r>
+        <w:rPr>
+          <w:sz w:val="28"/>
+          <w:szCs w:val="28"/>
+        </w:rPr>
+        <w:t>text()/@attribute</w:t>
+      </w:r>
+      <w:r>
+        <w:rPr>
+          <w:color w:val="92D050"/>
+          <w:sz w:val="28"/>
+          <w:szCs w:val="28"/>
+        </w:rPr>
+        <w:t>,</w:t>
+      </w:r>
+      <w:r>
+        <w:rPr>
+          <w:sz w:val="28"/>
+          <w:szCs w:val="28"/>
+        </w:rPr>
+        <w:t xml:space="preserve"> “expected value”</w:t>
+      </w:r>
+      <w:r>
+        <w:rPr>
+          <w:color w:val="92D050"/>
+          <w:sz w:val="28"/>
+          <w:szCs w:val="28"/>
+        </w:rPr>
+        <w:t>)</w:t>
+      </w:r>
+      <w:r>
+        <w:rPr>
+          <w:sz w:val="28"/>
+          <w:szCs w:val="28"/>
+        </w:rPr>
+        <w:t>]</w:t>
       </w:r>
     </w:p>
     <w:p>
@@ -4713,10 +4261,17 @@
           <w:tab w:val="left" w:pos="1804"/>
         </w:tabs>
         <w:rPr>
-          <w:sz w:val="32"/>
-          <w:szCs w:val="32"/>
-        </w:rPr>
-      </w:pPr>
+          <w:sz w:val="28"/>
+          <w:szCs w:val="28"/>
+        </w:rPr>
+      </w:pPr>
+      <w:r>
+        <w:rPr>
+          <w:sz w:val="28"/>
+          <w:szCs w:val="28"/>
+        </w:rPr>
+        <w:t xml:space="preserve">EG : </w:t>
+      </w:r>
     </w:p>
     <w:p>
       <w:pPr>
@@ -4734,7 +4289,26 @@
           <w:sz w:val="28"/>
           <w:szCs w:val="28"/>
         </w:rPr>
-        <w:t>//</w:t>
+        <w:tab/>
+      </w:r>
+    </w:p>
+    <w:p>
+      <w:pPr>
+        <w:pStyle w:val="ListParagraph"/>
+        <w:tabs>
+          <w:tab w:val="left" w:pos="1804"/>
+        </w:tabs>
+        <w:rPr>
+          <w:sz w:val="28"/>
+          <w:szCs w:val="28"/>
+        </w:rPr>
+      </w:pPr>
+      <w:r>
+        <w:rPr>
+          <w:sz w:val="28"/>
+          <w:szCs w:val="28"/>
+        </w:rPr>
+        <w:t xml:space="preserve">//h1[contains(text(),’we </w:t>
       </w:r>
       <w:proofErr w:type="spellStart"/>
       <w:r>
@@ -4742,7 +4316,7 @@
           <w:sz w:val="28"/>
           <w:szCs w:val="28"/>
         </w:rPr>
-        <w:t>htmlTag</w:t>
+        <w:t>hava</w:t>
       </w:r>
       <w:proofErr w:type="spellEnd"/>
       <w:r>
@@ -4750,61 +4324,14 @@
           <w:sz w:val="28"/>
           <w:szCs w:val="28"/>
         </w:rPr>
-        <w:t>[</w:t>
-      </w:r>
-      <w:r>
-        <w:rPr>
-          <w:color w:val="92D050"/>
-          <w:sz w:val="28"/>
-          <w:szCs w:val="28"/>
-        </w:rPr>
-        <w:t>contains(</w:t>
-      </w:r>
-      <w:proofErr w:type="gramStart"/>
-      <w:r>
-        <w:rPr>
-          <w:sz w:val="28"/>
-          <w:szCs w:val="28"/>
-        </w:rPr>
-        <w:t>text(</w:t>
-      </w:r>
-      <w:proofErr w:type="gramEnd"/>
-      <w:r>
-        <w:rPr>
-          <w:sz w:val="28"/>
-          <w:szCs w:val="28"/>
-        </w:rPr>
-        <w:t>)/@attribute</w:t>
-      </w:r>
-      <w:r>
-        <w:rPr>
-          <w:color w:val="92D050"/>
-          <w:sz w:val="28"/>
-          <w:szCs w:val="28"/>
-        </w:rPr>
-        <w:t>,</w:t>
-      </w:r>
-      <w:r>
-        <w:rPr>
-          <w:sz w:val="28"/>
-          <w:szCs w:val="28"/>
-        </w:rPr>
-        <w:t xml:space="preserve"> “expected value”</w:t>
-      </w:r>
-      <w:r>
-        <w:rPr>
-          <w:color w:val="92D050"/>
-          <w:sz w:val="28"/>
-          <w:szCs w:val="28"/>
-        </w:rPr>
-        <w:t>)</w:t>
-      </w:r>
-      <w:r>
-        <w:rPr>
-          <w:sz w:val="28"/>
-          <w:szCs w:val="28"/>
-        </w:rPr>
-        <w:t>]</w:t>
+        <w:t>’)]</w:t>
+      </w:r>
+      <w:r>
+        <w:rPr>
+          <w:sz w:val="28"/>
+          <w:szCs w:val="28"/>
+        </w:rPr>
+        <w:t xml:space="preserve">   :  correct</w:t>
       </w:r>
     </w:p>
     <w:p>
@@ -4818,21 +4345,19 @@
           <w:szCs w:val="28"/>
         </w:rPr>
       </w:pPr>
-      <w:proofErr w:type="gramStart"/>
-      <w:r>
-        <w:rPr>
-          <w:sz w:val="28"/>
-          <w:szCs w:val="28"/>
-        </w:rPr>
-        <w:t>EG :</w:t>
-      </w:r>
-      <w:proofErr w:type="gramEnd"/>
-      <w:r>
-        <w:rPr>
-          <w:sz w:val="28"/>
-          <w:szCs w:val="28"/>
-        </w:rPr>
-        <w:t xml:space="preserve"> </w:t>
+      <w:r>
+        <w:rPr>
+          <w:sz w:val="28"/>
+          <w:szCs w:val="28"/>
+        </w:rPr>
+        <w:t>//h1[contains(text(),'users')]</w:t>
+      </w:r>
+      <w:r>
+        <w:rPr>
+          <w:sz w:val="28"/>
+          <w:szCs w:val="28"/>
+        </w:rPr>
+        <w:t xml:space="preserve">   :  correct</w:t>
       </w:r>
     </w:p>
     <w:p>
@@ -4846,13 +4371,6 @@
           <w:szCs w:val="28"/>
         </w:rPr>
       </w:pPr>
-      <w:r>
-        <w:rPr>
-          <w:sz w:val="28"/>
-          <w:szCs w:val="28"/>
-        </w:rPr>
-        <w:tab/>
-      </w:r>
     </w:p>
     <w:p>
       <w:pPr>
@@ -4870,46 +4388,14 @@
           <w:sz w:val="28"/>
           <w:szCs w:val="28"/>
         </w:rPr>
-        <w:t>//h1[contains(</w:t>
-      </w:r>
-      <w:proofErr w:type="gramStart"/>
-      <w:r>
-        <w:rPr>
-          <w:sz w:val="28"/>
-          <w:szCs w:val="28"/>
-        </w:rPr>
-        <w:t>text(</w:t>
-      </w:r>
-      <w:proofErr w:type="gramEnd"/>
-      <w:r>
-        <w:rPr>
-          <w:sz w:val="28"/>
-          <w:szCs w:val="28"/>
-        </w:rPr>
-        <w:t xml:space="preserve">),’we </w:t>
-      </w:r>
-      <w:proofErr w:type="spellStart"/>
-      <w:r>
-        <w:rPr>
-          <w:sz w:val="28"/>
-          <w:szCs w:val="28"/>
-        </w:rPr>
-        <w:t>hava</w:t>
-      </w:r>
-      <w:proofErr w:type="spellEnd"/>
-      <w:r>
-        <w:rPr>
-          <w:sz w:val="28"/>
-          <w:szCs w:val="28"/>
-        </w:rPr>
-        <w:t>’)]</w:t>
-      </w:r>
-      <w:r>
-        <w:rPr>
-          <w:sz w:val="28"/>
-          <w:szCs w:val="28"/>
-        </w:rPr>
-        <w:t xml:space="preserve">   :  correct</w:t>
+        <w:t>//input[contains(@value,'RS')]</w:t>
+      </w:r>
+      <w:r>
+        <w:rPr>
+          <w:sz w:val="28"/>
+          <w:szCs w:val="28"/>
+        </w:rPr>
+        <w:t xml:space="preserve">  :  correct</w:t>
       </w:r>
     </w:p>
     <w:p>
@@ -4928,135 +4414,7 @@
           <w:sz w:val="28"/>
           <w:szCs w:val="28"/>
         </w:rPr>
-        <w:t>//h1[contains(text(),'users'</w:t>
-      </w:r>
-      <w:proofErr w:type="gramStart"/>
-      <w:r>
-        <w:rPr>
-          <w:sz w:val="28"/>
-          <w:szCs w:val="28"/>
-        </w:rPr>
-        <w:t>)]</w:t>
-      </w:r>
-      <w:r>
-        <w:rPr>
-          <w:sz w:val="28"/>
-          <w:szCs w:val="28"/>
-        </w:rPr>
-        <w:t xml:space="preserve">   </w:t>
-      </w:r>
-      <w:proofErr w:type="gramEnd"/>
-      <w:r>
-        <w:rPr>
-          <w:sz w:val="28"/>
-          <w:szCs w:val="28"/>
-        </w:rPr>
-        <w:t>:  correct</w:t>
-      </w:r>
-    </w:p>
-    <w:p>
-      <w:pPr>
-        <w:pStyle w:val="ListParagraph"/>
-        <w:tabs>
-          <w:tab w:val="left" w:pos="1804"/>
-        </w:tabs>
-        <w:rPr>
-          <w:sz w:val="28"/>
-          <w:szCs w:val="28"/>
-        </w:rPr>
-      </w:pPr>
-    </w:p>
-    <w:p>
-      <w:pPr>
-        <w:pStyle w:val="ListParagraph"/>
-        <w:tabs>
-          <w:tab w:val="left" w:pos="1804"/>
-        </w:tabs>
-        <w:rPr>
-          <w:sz w:val="28"/>
-          <w:szCs w:val="28"/>
-        </w:rPr>
-      </w:pPr>
-      <w:r>
-        <w:rPr>
-          <w:sz w:val="28"/>
-          <w:szCs w:val="28"/>
-        </w:rPr>
-        <w:t>//input[contains(@</w:t>
-      </w:r>
-      <w:proofErr w:type="spellStart"/>
-      <w:r>
-        <w:rPr>
-          <w:sz w:val="28"/>
-          <w:szCs w:val="28"/>
-        </w:rPr>
-        <w:t>value,'RS</w:t>
-      </w:r>
-      <w:proofErr w:type="spellEnd"/>
-      <w:r>
-        <w:rPr>
-          <w:sz w:val="28"/>
-          <w:szCs w:val="28"/>
-        </w:rPr>
-        <w:t>'</w:t>
-      </w:r>
-      <w:proofErr w:type="gramStart"/>
-      <w:r>
-        <w:rPr>
-          <w:sz w:val="28"/>
-          <w:szCs w:val="28"/>
-        </w:rPr>
-        <w:t>)]</w:t>
-      </w:r>
-      <w:r>
-        <w:rPr>
-          <w:sz w:val="28"/>
-          <w:szCs w:val="28"/>
-        </w:rPr>
-        <w:t xml:space="preserve">  :</w:t>
-      </w:r>
-      <w:proofErr w:type="gramEnd"/>
-      <w:r>
-        <w:rPr>
-          <w:sz w:val="28"/>
-          <w:szCs w:val="28"/>
-        </w:rPr>
-        <w:t xml:space="preserve">  correct</w:t>
-      </w:r>
-    </w:p>
-    <w:p>
-      <w:pPr>
-        <w:pStyle w:val="ListParagraph"/>
-        <w:tabs>
-          <w:tab w:val="left" w:pos="1804"/>
-        </w:tabs>
-        <w:rPr>
-          <w:sz w:val="28"/>
-          <w:szCs w:val="28"/>
-        </w:rPr>
-      </w:pPr>
-      <w:r>
-        <w:rPr>
-          <w:sz w:val="28"/>
-          <w:szCs w:val="28"/>
-        </w:rPr>
-        <w:t>//h1[normalize-space(</w:t>
-      </w:r>
-      <w:proofErr w:type="gramStart"/>
-      <w:r>
-        <w:rPr>
-          <w:sz w:val="28"/>
-          <w:szCs w:val="28"/>
-        </w:rPr>
-        <w:t>text(</w:t>
-      </w:r>
-      <w:proofErr w:type="gramEnd"/>
-      <w:r>
-        <w:rPr>
-          <w:sz w:val="28"/>
-          <w:szCs w:val="28"/>
-        </w:rPr>
-        <w:t>).’</w:t>
+        <w:t>//h1[normalize-space(text().’</w:t>
       </w:r>
       <w:r>
         <w:rPr>
@@ -5153,7 +4511,6 @@
           <w:szCs w:val="28"/>
         </w:rPr>
       </w:pPr>
-      <w:proofErr w:type="gramStart"/>
       <w:r>
         <w:rPr>
           <w:sz w:val="28"/>
@@ -5166,15 +4523,7 @@
           <w:sz w:val="28"/>
           <w:szCs w:val="28"/>
         </w:rPr>
-        <w:t xml:space="preserve">  function</w:t>
-      </w:r>
-      <w:proofErr w:type="gramEnd"/>
-      <w:r>
-        <w:rPr>
-          <w:sz w:val="28"/>
-          <w:szCs w:val="28"/>
-        </w:rPr>
-        <w:t xml:space="preserve"> can identify the object using part of the string or complete string</w:t>
+        <w:t xml:space="preserve">  function can identify the object using part of the string or complete string</w:t>
       </w:r>
     </w:p>
     <w:p>
@@ -5197,23 +4546,7 @@
           <w:sz w:val="28"/>
           <w:szCs w:val="28"/>
         </w:rPr>
-        <w:t>using normalize-</w:t>
-      </w:r>
-      <w:proofErr w:type="gramStart"/>
-      <w:r>
-        <w:rPr>
-          <w:sz w:val="28"/>
-          <w:szCs w:val="28"/>
-        </w:rPr>
-        <w:t>space  function</w:t>
-      </w:r>
-      <w:proofErr w:type="gramEnd"/>
-      <w:r>
-        <w:rPr>
-          <w:sz w:val="28"/>
-          <w:szCs w:val="28"/>
-        </w:rPr>
-        <w:t xml:space="preserve"> we can ignore the space before &amp; after the String or attribute</w:t>
+        <w:t>using normalize-space  function we can ignore the space before &amp; after the String or attribute</w:t>
       </w:r>
     </w:p>
     <w:p>
@@ -5248,25 +4581,7 @@
           <w:sz w:val="32"/>
           <w:szCs w:val="32"/>
         </w:rPr>
-        <w:t xml:space="preserve">Case </w:t>
-      </w:r>
-      <w:proofErr w:type="gramStart"/>
-      <w:r>
-        <w:rPr>
-          <w:color w:val="C00000"/>
-          <w:sz w:val="32"/>
-          <w:szCs w:val="32"/>
-        </w:rPr>
-        <w:t>5 :</w:t>
-      </w:r>
-      <w:proofErr w:type="gramEnd"/>
-      <w:r>
-        <w:rPr>
-          <w:color w:val="C00000"/>
-          <w:sz w:val="32"/>
-          <w:szCs w:val="32"/>
-        </w:rPr>
-        <w:t xml:space="preserve"> </w:t>
+        <w:t xml:space="preserve">Case 5 : </w:t>
       </w:r>
       <w:r>
         <w:rPr>
@@ -5338,7 +4653,7 @@
         </w:rPr>
         <w:lastRenderedPageBreak/>
         <w:drawing>
-          <wp:inline distT="0" distB="0" distL="0" distR="0">
+          <wp:inline distT="0" distB="0" distL="0" distR="0" wp14:anchorId="5EB22E54" wp14:editId="74A8327D">
             <wp:extent cx="5727700" cy="2867660"/>
             <wp:effectExtent l="0" t="0" r="6350" b="8890"/>
             <wp:docPr id="33" name="Picture 33"/>
@@ -5398,23 +4713,13 @@
           <w:szCs w:val="32"/>
         </w:rPr>
       </w:pPr>
-      <w:proofErr w:type="gramStart"/>
-      <w:r>
-        <w:rPr>
-          <w:color w:val="C00000"/>
-          <w:sz w:val="32"/>
-          <w:szCs w:val="32"/>
-        </w:rPr>
-        <w:t>Syntax :</w:t>
-      </w:r>
-      <w:proofErr w:type="gramEnd"/>
-      <w:r>
-        <w:rPr>
-          <w:color w:val="C00000"/>
-          <w:sz w:val="32"/>
-          <w:szCs w:val="32"/>
-        </w:rPr>
-        <w:t xml:space="preserve"> </w:t>
+      <w:r>
+        <w:rPr>
+          <w:color w:val="C00000"/>
+          <w:sz w:val="32"/>
+          <w:szCs w:val="32"/>
+        </w:rPr>
+        <w:t xml:space="preserve">Syntax : </w:t>
       </w:r>
     </w:p>
     <w:p>
@@ -5544,23 +4849,7 @@
           <w:sz w:val="32"/>
           <w:szCs w:val="32"/>
         </w:rPr>
-        <w:t>-space(</w:t>
-      </w:r>
-      <w:proofErr w:type="gramStart"/>
-      <w:r>
-        <w:rPr>
-          <w:sz w:val="32"/>
-          <w:szCs w:val="32"/>
-        </w:rPr>
-        <w:t>text(</w:t>
-      </w:r>
-      <w:proofErr w:type="gramEnd"/>
-      <w:r>
-        <w:rPr>
-          <w:sz w:val="32"/>
-          <w:szCs w:val="32"/>
-        </w:rPr>
-        <w:t>))=’we have product’]</w:t>
+        <w:t>-space(text())=’we have product’]</w:t>
       </w:r>
     </w:p>
     <w:p>
@@ -5641,33 +4930,15 @@
           <w:sz w:val="32"/>
           <w:szCs w:val="32"/>
         </w:rPr>
-        <w:t xml:space="preserve">ase </w:t>
-      </w:r>
-      <w:proofErr w:type="gramStart"/>
-      <w:r>
-        <w:rPr>
-          <w:color w:val="C00000"/>
-          <w:sz w:val="32"/>
-          <w:szCs w:val="32"/>
-        </w:rPr>
-        <w:t>6</w:t>
-      </w:r>
-      <w:r>
-        <w:rPr>
-          <w:color w:val="C00000"/>
-          <w:sz w:val="32"/>
-          <w:szCs w:val="32"/>
-        </w:rPr>
-        <w:t xml:space="preserve"> :</w:t>
-      </w:r>
-      <w:proofErr w:type="gramEnd"/>
-      <w:r>
-        <w:rPr>
-          <w:color w:val="C00000"/>
-          <w:sz w:val="32"/>
-          <w:szCs w:val="32"/>
-        </w:rPr>
-        <w:t xml:space="preserve"> how to identify the when similar</w:t>
+        <w:t>ase 6</w:t>
+      </w:r>
+      <w:r>
+        <w:rPr>
+          <w:color w:val="C00000"/>
+          <w:sz w:val="32"/>
+          <w:szCs w:val="32"/>
+        </w:rPr>
+        <w:t xml:space="preserve"> : how to identify the when similar</w:t>
       </w:r>
       <w:r>
         <w:rPr>
@@ -5741,7 +5012,7 @@
         </w:rPr>
         <w:lastRenderedPageBreak/>
         <w:drawing>
-          <wp:inline distT="0" distB="0" distL="0" distR="0" wp14:anchorId="7089856F" wp14:editId="6338ED9D">
+          <wp:inline distT="0" distB="0" distL="0" distR="0" wp14:anchorId="73A5EDC7" wp14:editId="3F9FDB9C">
             <wp:extent cx="5731510" cy="4419600"/>
             <wp:effectExtent l="0" t="0" r="2540" b="0"/>
             <wp:docPr id="34" name="Picture 34"/>
@@ -5799,7 +5070,7 @@
           <w:lang w:eastAsia="en-IN"/>
         </w:rPr>
         <w:drawing>
-          <wp:inline distT="0" distB="0" distL="0" distR="0">
+          <wp:inline distT="0" distB="0" distL="0" distR="0" wp14:anchorId="72B8D44C" wp14:editId="37B565A4">
             <wp:extent cx="5727700" cy="2647950"/>
             <wp:effectExtent l="0" t="0" r="6350" b="0"/>
             <wp:docPr id="36" name="Picture 36"/>
@@ -5871,7 +5142,7 @@
         </w:rPr>
         <w:lastRenderedPageBreak/>
         <w:drawing>
-          <wp:inline distT="0" distB="0" distL="0" distR="0">
+          <wp:inline distT="0" distB="0" distL="0" distR="0" wp14:anchorId="45090BFC" wp14:editId="071DA05C">
             <wp:extent cx="5727700" cy="4389120"/>
             <wp:effectExtent l="0" t="0" r="6350" b="0"/>
             <wp:docPr id="35" name="Picture 35"/>
@@ -5991,107 +5262,26 @@
           <w:sz w:val="32"/>
           <w:szCs w:val="32"/>
         </w:rPr>
-        <w:t>[@</w:t>
-      </w:r>
-      <w:proofErr w:type="spellStart"/>
-      <w:r>
-        <w:rPr>
-          <w:sz w:val="32"/>
-          <w:szCs w:val="32"/>
-        </w:rPr>
-        <w:t>att</w:t>
-      </w:r>
-      <w:proofErr w:type="spellEnd"/>
-      <w:r>
-        <w:rPr>
-          <w:sz w:val="32"/>
-          <w:szCs w:val="32"/>
-        </w:rPr>
-        <w:t>=’value’]/</w:t>
-      </w:r>
-      <w:proofErr w:type="spellStart"/>
-      <w:r>
-        <w:rPr>
-          <w:sz w:val="32"/>
-          <w:szCs w:val="32"/>
-        </w:rPr>
-        <w:t>childHtmlTag</w:t>
-      </w:r>
-      <w:proofErr w:type="spellEnd"/>
-      <w:r>
-        <w:rPr>
-          <w:sz w:val="32"/>
-          <w:szCs w:val="32"/>
-        </w:rPr>
-        <w:t>[@</w:t>
-      </w:r>
-      <w:proofErr w:type="spellStart"/>
-      <w:r>
-        <w:rPr>
-          <w:sz w:val="32"/>
-          <w:szCs w:val="32"/>
-        </w:rPr>
-        <w:t>att</w:t>
-      </w:r>
-      <w:proofErr w:type="spellEnd"/>
-      <w:r>
-        <w:rPr>
-          <w:sz w:val="32"/>
-          <w:szCs w:val="32"/>
-        </w:rPr>
-        <w:t>=’value’]</w:t>
-      </w:r>
-    </w:p>
-    <w:p>
-      <w:pPr>
-        <w:tabs>
-          <w:tab w:val="left" w:pos="1804"/>
-        </w:tabs>
-        <w:rPr>
-          <w:sz w:val="32"/>
-          <w:szCs w:val="32"/>
-        </w:rPr>
-      </w:pPr>
-      <w:r>
-        <w:rPr>
-          <w:sz w:val="32"/>
-          <w:szCs w:val="32"/>
-        </w:rPr>
-        <w:t>//div[@class='</w:t>
-      </w:r>
-      <w:proofErr w:type="spellStart"/>
-      <w:r>
-        <w:rPr>
-          <w:sz w:val="32"/>
-          <w:szCs w:val="32"/>
-        </w:rPr>
-        <w:t>samsung</w:t>
-      </w:r>
-      <w:proofErr w:type="spellEnd"/>
-      <w:r>
-        <w:rPr>
-          <w:sz w:val="32"/>
-          <w:szCs w:val="32"/>
-        </w:rPr>
-        <w:t>']/</w:t>
-      </w:r>
-      <w:proofErr w:type="gramStart"/>
-      <w:r>
-        <w:rPr>
-          <w:sz w:val="32"/>
-          <w:szCs w:val="32"/>
-        </w:rPr>
-        <w:t>input[</w:t>
-      </w:r>
-      <w:proofErr w:type="gramEnd"/>
-      <w:r>
-        <w:rPr>
-          <w:sz w:val="32"/>
-          <w:szCs w:val="32"/>
-        </w:rPr>
-        <w:t>@value='Add to cart'] //div[@class=</w:t>
-      </w:r>
-      <w:proofErr w:type="spellStart"/>
+        <w:t>[@att=’value’]/childHtmlTag[@att=’value’]</w:t>
+      </w:r>
+    </w:p>
+    <w:p>
+      <w:pPr>
+        <w:tabs>
+          <w:tab w:val="left" w:pos="1804"/>
+        </w:tabs>
+        <w:rPr>
+          <w:sz w:val="32"/>
+          <w:szCs w:val="32"/>
+        </w:rPr>
+      </w:pPr>
+      <w:r>
+        <w:rPr>
+          <w:sz w:val="32"/>
+          <w:szCs w:val="32"/>
+        </w:rPr>
+        <w:t>//div[@class='samsung']/input[@value='Add to cart'] //div[@class=</w:t>
+      </w:r>
       <w:r>
         <w:rPr>
           <w:sz w:val="32"/>
@@ -6099,7 +5289,6 @@
         </w:rPr>
         <w:t>iphone</w:t>
       </w:r>
-      <w:proofErr w:type="spellEnd"/>
       <w:r>
         <w:rPr>
           <w:sz w:val="32"/>
@@ -6140,7 +5329,6 @@
           <w:szCs w:val="32"/>
         </w:rPr>
       </w:pPr>
-      <w:proofErr w:type="gramStart"/>
       <w:r>
         <w:rPr>
           <w:sz w:val="32"/>
@@ -6148,7 +5336,6 @@
         </w:rPr>
         <w:t>Solution :</w:t>
       </w:r>
-      <w:proofErr w:type="gramEnd"/>
     </w:p>
     <w:p>
       <w:pPr>
@@ -6168,23 +5355,7 @@
           <w:sz w:val="32"/>
           <w:szCs w:val="32"/>
         </w:rPr>
-        <w:t xml:space="preserve">When object not able to identify using multiple </w:t>
-      </w:r>
-      <w:proofErr w:type="gramStart"/>
-      <w:r>
-        <w:rPr>
-          <w:sz w:val="32"/>
-          <w:szCs w:val="32"/>
-        </w:rPr>
-        <w:t>attribute ,</w:t>
-      </w:r>
-      <w:proofErr w:type="gramEnd"/>
-      <w:r>
-        <w:rPr>
-          <w:sz w:val="32"/>
-          <w:szCs w:val="32"/>
-        </w:rPr>
-        <w:t xml:space="preserve"> in such cases will take reference of parent / </w:t>
+        <w:t xml:space="preserve">When object not able to identify using multiple attribute , in such cases will take reference of parent / </w:t>
       </w:r>
       <w:proofErr w:type="spellStart"/>
       <w:r>
@@ -6362,7 +5533,7 @@
           <w:lang w:eastAsia="en-IN"/>
         </w:rPr>
         <w:drawing>
-          <wp:inline distT="0" distB="0" distL="0" distR="0">
+          <wp:inline distT="0" distB="0" distL="0" distR="0" wp14:anchorId="169DACC9" wp14:editId="39FA59CF">
             <wp:extent cx="5727700" cy="3928110"/>
             <wp:effectExtent l="0" t="0" r="6350" b="0"/>
             <wp:docPr id="38" name="Picture 38"/>
@@ -6432,7 +5603,7 @@
         </w:rPr>
         <w:lastRenderedPageBreak/>
         <w:drawing>
-          <wp:inline distT="0" distB="0" distL="0" distR="0" wp14:anchorId="52FB7539" wp14:editId="6D494204">
+          <wp:inline distT="0" distB="0" distL="0" distR="0" wp14:anchorId="54543C48" wp14:editId="3E996714">
             <wp:extent cx="5731510" cy="4569460"/>
             <wp:effectExtent l="0" t="0" r="2540" b="2540"/>
             <wp:docPr id="39" name="Picture 39"/>
@@ -6488,7 +5659,7 @@
           <w:lang w:eastAsia="en-IN"/>
         </w:rPr>
         <w:drawing>
-          <wp:inline distT="0" distB="0" distL="0" distR="0">
+          <wp:inline distT="0" distB="0" distL="0" distR="0" wp14:anchorId="1E144AB3" wp14:editId="0693BCDE">
             <wp:extent cx="5727700" cy="2070100"/>
             <wp:effectExtent l="0" t="0" r="6350" b="6350"/>
             <wp:docPr id="37" name="Picture 37"/>
@@ -6646,9 +5817,9 @@
           <w:szCs w:val="36"/>
           <w:lang w:val="en"/>
         </w:rPr>
-        <w:t>[@</w:t>
-      </w:r>
-      <w:proofErr w:type="spellStart"/>
+        <w:t>[@att='value</w:t>
+      </w:r>
+      <w:proofErr w:type="gramStart"/>
       <w:r>
         <w:rPr>
           <w:rFonts w:ascii="Calibri" w:hAnsi="Calibri" w:cs="Calibri"/>
@@ -6659,9 +5830,34 @@
           <w:szCs w:val="36"/>
           <w:lang w:val="en"/>
         </w:rPr>
-        <w:t>att</w:t>
-      </w:r>
-      <w:proofErr w:type="spellEnd"/>
+        <w:t xml:space="preserve">'] </w:t>
+      </w:r>
+      <w:r>
+        <w:rPr>
+          <w:rFonts w:ascii="Calibri" w:hAnsi="Calibri" w:cs="Calibri"/>
+          <w:b/>
+          <w:bCs/>
+          <w:color w:val="880015"/>
+          <w:sz w:val="36"/>
+          <w:szCs w:val="36"/>
+          <w:lang w:val="en"/>
+        </w:rPr>
+        <w:t xml:space="preserve">  </w:t>
+      </w:r>
+      <w:proofErr w:type="gramEnd"/>
+      <w:r>
+        <w:rPr>
+          <w:rFonts w:ascii="Calibri" w:hAnsi="Calibri" w:cs="Calibri"/>
+          <w:b/>
+          <w:bCs/>
+          <w:color w:val="00A2E8"/>
+          <w:sz w:val="36"/>
+          <w:szCs w:val="36"/>
+          <w:lang w:val="en"/>
+        </w:rPr>
+        <w:t xml:space="preserve">/following-sibling:: </w:t>
+      </w:r>
+      <w:proofErr w:type="spellStart"/>
       <w:r>
         <w:rPr>
           <w:rFonts w:ascii="Calibri" w:hAnsi="Calibri" w:cs="Calibri"/>
@@ -6672,9 +5868,9 @@
           <w:szCs w:val="36"/>
           <w:lang w:val="en"/>
         </w:rPr>
-        <w:t>='value</w:t>
-      </w:r>
-      <w:proofErr w:type="gramStart"/>
+        <w:t>nextSiblingHTMLTag</w:t>
+      </w:r>
+      <w:proofErr w:type="spellEnd"/>
       <w:r>
         <w:rPr>
           <w:rFonts w:ascii="Calibri" w:hAnsi="Calibri" w:cs="Calibri"/>
@@ -6685,21 +5881,80 @@
           <w:szCs w:val="36"/>
           <w:lang w:val="en"/>
         </w:rPr>
-        <w:t xml:space="preserve">'] </w:t>
-      </w:r>
-      <w:r>
+        <w:t>[@attribute='value']</w:t>
+      </w:r>
+    </w:p>
+    <w:p>
+      <w:pPr>
+        <w:autoSpaceDE w:val="0"/>
+        <w:autoSpaceDN w:val="0"/>
+        <w:adjustRightInd w:val="0"/>
+        <w:spacing w:after="0" w:line="240" w:lineRule="auto"/>
+        <w:rPr>
+          <w:rFonts w:ascii="Calibri" w:hAnsi="Calibri" w:cs="Calibri"/>
+          <w:b/>
+          <w:bCs/>
+          <w:color w:val="000000"/>
+          <w:sz w:val="36"/>
+          <w:szCs w:val="36"/>
+          <w:lang w:val="en"/>
+        </w:rPr>
+      </w:pPr>
+    </w:p>
+    <w:p>
+      <w:pPr>
+        <w:autoSpaceDE w:val="0"/>
+        <w:autoSpaceDN w:val="0"/>
+        <w:adjustRightInd w:val="0"/>
+        <w:spacing w:after="0" w:line="240" w:lineRule="auto"/>
         <w:rPr>
           <w:rFonts w:ascii="Calibri" w:hAnsi="Calibri" w:cs="Calibri"/>
           <w:b/>
           <w:bCs/>
           <w:color w:val="880015"/>
+          <w:sz w:val="56"/>
+          <w:szCs w:val="56"/>
+          <w:lang w:val="en"/>
+        </w:rPr>
+      </w:pPr>
+      <w:r>
+        <w:rPr>
+          <w:rFonts w:ascii="Calibri" w:hAnsi="Calibri" w:cs="Calibri"/>
+          <w:b/>
+          <w:bCs/>
+          <w:color w:val="000000"/>
           <w:sz w:val="36"/>
           <w:szCs w:val="36"/>
           <w:lang w:val="en"/>
         </w:rPr>
-        <w:t xml:space="preserve">  </w:t>
-      </w:r>
-      <w:proofErr w:type="gramEnd"/>
+        <w:t>//</w:t>
+      </w:r>
+      <w:proofErr w:type="spellStart"/>
+      <w:r>
+        <w:rPr>
+          <w:rFonts w:ascii="Calibri" w:hAnsi="Calibri" w:cs="Calibri"/>
+          <w:b/>
+          <w:bCs/>
+          <w:color w:val="000000"/>
+          <w:sz w:val="36"/>
+          <w:szCs w:val="36"/>
+          <w:lang w:val="en"/>
+        </w:rPr>
+        <w:t>img</w:t>
+      </w:r>
+      <w:proofErr w:type="spellEnd"/>
+      <w:r>
+        <w:rPr>
+          <w:rFonts w:ascii="Calibri" w:hAnsi="Calibri" w:cs="Calibri"/>
+          <w:b/>
+          <w:bCs/>
+          <w:color w:val="000000"/>
+          <w:sz w:val="36"/>
+          <w:szCs w:val="36"/>
+          <w:lang w:val="en"/>
+        </w:rPr>
+        <w:t>[@src='image3.png']</w:t>
+      </w:r>
       <w:r>
         <w:rPr>
           <w:rFonts w:ascii="Calibri" w:hAnsi="Calibri" w:cs="Calibri"/>
@@ -6710,9 +5965,34 @@
           <w:szCs w:val="36"/>
           <w:lang w:val="en"/>
         </w:rPr>
-        <w:t xml:space="preserve">/following-sibling:: </w:t>
-      </w:r>
-      <w:proofErr w:type="spellStart"/>
+        <w:t>/following-</w:t>
+      </w:r>
+      <w:proofErr w:type="gramStart"/>
+      <w:r>
+        <w:rPr>
+          <w:rFonts w:ascii="Calibri" w:hAnsi="Calibri" w:cs="Calibri"/>
+          <w:b/>
+          <w:bCs/>
+          <w:color w:val="00A2E8"/>
+          <w:sz w:val="36"/>
+          <w:szCs w:val="36"/>
+          <w:lang w:val="en"/>
+        </w:rPr>
+        <w:t>sibling::</w:t>
+      </w:r>
+      <w:proofErr w:type="gramEnd"/>
+      <w:r>
+        <w:rPr>
+          <w:rFonts w:ascii="Calibri" w:hAnsi="Calibri" w:cs="Calibri"/>
+          <w:b/>
+          <w:bCs/>
+          <w:color w:val="00A2E8"/>
+          <w:sz w:val="36"/>
+          <w:szCs w:val="36"/>
+          <w:lang w:val="en"/>
+        </w:rPr>
+        <w:t xml:space="preserve"> </w:t>
+      </w:r>
       <w:r>
         <w:rPr>
           <w:rFonts w:ascii="Calibri" w:hAnsi="Calibri" w:cs="Calibri"/>
@@ -6723,167 +6003,6 @@
           <w:szCs w:val="36"/>
           <w:lang w:val="en"/>
         </w:rPr>
-        <w:t>nextSiblingHTMLTag</w:t>
-      </w:r>
-      <w:proofErr w:type="spellEnd"/>
-      <w:r>
-        <w:rPr>
-          <w:rFonts w:ascii="Calibri" w:hAnsi="Calibri" w:cs="Calibri"/>
-          <w:b/>
-          <w:bCs/>
-          <w:color w:val="000000"/>
-          <w:sz w:val="36"/>
-          <w:szCs w:val="36"/>
-          <w:lang w:val="en"/>
-        </w:rPr>
-        <w:t>[@attribute='value']</w:t>
-      </w:r>
-    </w:p>
-    <w:p>
-      <w:pPr>
-        <w:autoSpaceDE w:val="0"/>
-        <w:autoSpaceDN w:val="0"/>
-        <w:adjustRightInd w:val="0"/>
-        <w:spacing w:after="0" w:line="240" w:lineRule="auto"/>
-        <w:rPr>
-          <w:rFonts w:ascii="Calibri" w:hAnsi="Calibri" w:cs="Calibri"/>
-          <w:b/>
-          <w:bCs/>
-          <w:color w:val="000000"/>
-          <w:sz w:val="36"/>
-          <w:szCs w:val="36"/>
-          <w:lang w:val="en"/>
-        </w:rPr>
-      </w:pPr>
-    </w:p>
-    <w:p>
-      <w:pPr>
-        <w:autoSpaceDE w:val="0"/>
-        <w:autoSpaceDN w:val="0"/>
-        <w:adjustRightInd w:val="0"/>
-        <w:spacing w:after="0" w:line="240" w:lineRule="auto"/>
-        <w:rPr>
-          <w:rFonts w:ascii="Calibri" w:hAnsi="Calibri" w:cs="Calibri"/>
-          <w:b/>
-          <w:bCs/>
-          <w:color w:val="880015"/>
-          <w:sz w:val="56"/>
-          <w:szCs w:val="56"/>
-          <w:lang w:val="en"/>
-        </w:rPr>
-      </w:pPr>
-      <w:r>
-        <w:rPr>
-          <w:rFonts w:ascii="Calibri" w:hAnsi="Calibri" w:cs="Calibri"/>
-          <w:b/>
-          <w:bCs/>
-          <w:color w:val="000000"/>
-          <w:sz w:val="36"/>
-          <w:szCs w:val="36"/>
-          <w:lang w:val="en"/>
-        </w:rPr>
-        <w:t>//</w:t>
-      </w:r>
-      <w:proofErr w:type="spellStart"/>
-      <w:r>
-        <w:rPr>
-          <w:rFonts w:ascii="Calibri" w:hAnsi="Calibri" w:cs="Calibri"/>
-          <w:b/>
-          <w:bCs/>
-          <w:color w:val="000000"/>
-          <w:sz w:val="36"/>
-          <w:szCs w:val="36"/>
-          <w:lang w:val="en"/>
-        </w:rPr>
-        <w:t>img</w:t>
-      </w:r>
-      <w:proofErr w:type="spellEnd"/>
-      <w:r>
-        <w:rPr>
-          <w:rFonts w:ascii="Calibri" w:hAnsi="Calibri" w:cs="Calibri"/>
-          <w:b/>
-          <w:bCs/>
-          <w:color w:val="000000"/>
-          <w:sz w:val="36"/>
-          <w:szCs w:val="36"/>
-          <w:lang w:val="en"/>
-        </w:rPr>
-        <w:t>[@</w:t>
-      </w:r>
-      <w:proofErr w:type="spellStart"/>
-      <w:r>
-        <w:rPr>
-          <w:rFonts w:ascii="Calibri" w:hAnsi="Calibri" w:cs="Calibri"/>
-          <w:b/>
-          <w:bCs/>
-          <w:color w:val="000000"/>
-          <w:sz w:val="36"/>
-          <w:szCs w:val="36"/>
-          <w:lang w:val="en"/>
-        </w:rPr>
-        <w:t>src</w:t>
-      </w:r>
-      <w:proofErr w:type="spellEnd"/>
-      <w:r>
-        <w:rPr>
-          <w:rFonts w:ascii="Calibri" w:hAnsi="Calibri" w:cs="Calibri"/>
-          <w:b/>
-          <w:bCs/>
-          <w:color w:val="000000"/>
-          <w:sz w:val="36"/>
-          <w:szCs w:val="36"/>
-          <w:lang w:val="en"/>
-        </w:rPr>
-        <w:t>='image3.png']</w:t>
-      </w:r>
-      <w:r>
-        <w:rPr>
-          <w:rFonts w:ascii="Calibri" w:hAnsi="Calibri" w:cs="Calibri"/>
-          <w:b/>
-          <w:bCs/>
-          <w:color w:val="00A2E8"/>
-          <w:sz w:val="36"/>
-          <w:szCs w:val="36"/>
-          <w:lang w:val="en"/>
-        </w:rPr>
-        <w:t>/following-</w:t>
-      </w:r>
-      <w:proofErr w:type="gramStart"/>
-      <w:r>
-        <w:rPr>
-          <w:rFonts w:ascii="Calibri" w:hAnsi="Calibri" w:cs="Calibri"/>
-          <w:b/>
-          <w:bCs/>
-          <w:color w:val="00A2E8"/>
-          <w:sz w:val="36"/>
-          <w:szCs w:val="36"/>
-          <w:lang w:val="en"/>
-        </w:rPr>
-        <w:t>sibling::</w:t>
-      </w:r>
-      <w:proofErr w:type="gramEnd"/>
-      <w:r>
-        <w:rPr>
-          <w:rFonts w:ascii="Calibri" w:hAnsi="Calibri" w:cs="Calibri"/>
-          <w:b/>
-          <w:bCs/>
-          <w:color w:val="00A2E8"/>
-          <w:sz w:val="36"/>
-          <w:szCs w:val="36"/>
-          <w:lang w:val="en"/>
-        </w:rPr>
-        <w:t xml:space="preserve"> </w:t>
-      </w:r>
-      <w:r>
-        <w:rPr>
-          <w:rFonts w:ascii="Calibri" w:hAnsi="Calibri" w:cs="Calibri"/>
-          <w:b/>
-          <w:bCs/>
-          <w:color w:val="000000"/>
-          <w:sz w:val="36"/>
-          <w:szCs w:val="36"/>
-          <w:lang w:val="en"/>
-        </w:rPr>
         <w:t>input[@value='Add to cart']</w:t>
       </w:r>
     </w:p>
@@ -7008,33 +6127,15 @@
           <w:sz w:val="32"/>
           <w:szCs w:val="32"/>
         </w:rPr>
-        <w:t xml:space="preserve">Case </w:t>
-      </w:r>
-      <w:proofErr w:type="gramStart"/>
-      <w:r>
-        <w:rPr>
-          <w:color w:val="C00000"/>
-          <w:sz w:val="32"/>
-          <w:szCs w:val="32"/>
-        </w:rPr>
-        <w:t>8</w:t>
-      </w:r>
-      <w:r>
-        <w:rPr>
-          <w:color w:val="C00000"/>
-          <w:sz w:val="32"/>
-          <w:szCs w:val="32"/>
-        </w:rPr>
-        <w:t xml:space="preserve"> :</w:t>
-      </w:r>
-      <w:proofErr w:type="gramEnd"/>
-      <w:r>
-        <w:rPr>
-          <w:color w:val="C00000"/>
-          <w:sz w:val="32"/>
-          <w:szCs w:val="32"/>
-        </w:rPr>
-        <w:t xml:space="preserve"> how to identify the object using </w:t>
+        <w:t>Case 8</w:t>
+      </w:r>
+      <w:r>
+        <w:rPr>
+          <w:color w:val="C00000"/>
+          <w:sz w:val="32"/>
+          <w:szCs w:val="32"/>
+        </w:rPr>
+        <w:t xml:space="preserve"> : how to identify the object using </w:t>
       </w:r>
       <w:r>
         <w:rPr>
@@ -7111,23 +6212,7 @@
           <w:sz w:val="32"/>
           <w:szCs w:val="32"/>
         </w:rPr>
-        <w:t>-</w:t>
-      </w:r>
-      <w:proofErr w:type="gramStart"/>
-      <w:r>
-        <w:rPr>
-          <w:sz w:val="32"/>
-          <w:szCs w:val="32"/>
-        </w:rPr>
-        <w:t>sibling::</w:t>
-      </w:r>
-      <w:proofErr w:type="gramEnd"/>
-      <w:r>
-        <w:rPr>
-          <w:sz w:val="32"/>
-          <w:szCs w:val="32"/>
-        </w:rPr>
-        <w:t>siblingHTMLTag[@att=’value’]</w:t>
+        <w:t>-sibling::siblingHTMLTag[@att=’value’]</w:t>
       </w:r>
     </w:p>
     <w:p>
@@ -7259,7 +6344,7 @@
         </w:rPr>
         <w:lastRenderedPageBreak/>
         <w:drawing>
-          <wp:inline distT="0" distB="0" distL="0" distR="0">
+          <wp:inline distT="0" distB="0" distL="0" distR="0" wp14:anchorId="295F5B74" wp14:editId="4A4439F8">
             <wp:extent cx="5727700" cy="2260600"/>
             <wp:effectExtent l="0" t="0" r="6350" b="6350"/>
             <wp:docPr id="40" name="Picture 40"/>
@@ -7331,125 +6416,67 @@
           <w:szCs w:val="32"/>
         </w:rPr>
       </w:pPr>
-      <w:proofErr w:type="gramStart"/>
-      <w:r>
-        <w:rPr>
-          <w:color w:val="C00000"/>
-          <w:sz w:val="32"/>
-          <w:szCs w:val="32"/>
-        </w:rPr>
-        <w:t>EG :</w:t>
-      </w:r>
-      <w:proofErr w:type="gramEnd"/>
-      <w:r>
-        <w:rPr>
-          <w:color w:val="C00000"/>
-          <w:sz w:val="32"/>
-          <w:szCs w:val="32"/>
-        </w:rPr>
-        <w:t xml:space="preserve"> </w:t>
-      </w:r>
-    </w:p>
-    <w:p>
-      <w:pPr>
-        <w:tabs>
-          <w:tab w:val="left" w:pos="1804"/>
-        </w:tabs>
-        <w:rPr>
-          <w:sz w:val="32"/>
-          <w:szCs w:val="32"/>
-        </w:rPr>
-      </w:pPr>
-      <w:r>
-        <w:rPr>
-          <w:sz w:val="32"/>
-          <w:szCs w:val="32"/>
-        </w:rPr>
-        <w:t xml:space="preserve">     //h1[text</w:t>
-      </w:r>
-      <w:proofErr w:type="gramStart"/>
-      <w:r>
-        <w:rPr>
-          <w:sz w:val="32"/>
-          <w:szCs w:val="32"/>
-        </w:rPr>
-        <w:t>()=</w:t>
-      </w:r>
-      <w:proofErr w:type="gramEnd"/>
-      <w:r>
-        <w:rPr>
-          <w:sz w:val="32"/>
-          <w:szCs w:val="32"/>
-        </w:rPr>
-        <w:t>’iphone-13’]/../..div[2]/input[@value=’Add to cart’]</w:t>
-      </w:r>
-    </w:p>
-    <w:p>
-      <w:pPr>
-        <w:tabs>
-          <w:tab w:val="left" w:pos="1804"/>
-        </w:tabs>
-        <w:rPr>
-          <w:sz w:val="32"/>
-          <w:szCs w:val="32"/>
-        </w:rPr>
-      </w:pPr>
-      <w:r>
-        <w:rPr>
-          <w:sz w:val="32"/>
-          <w:szCs w:val="32"/>
-        </w:rPr>
-        <w:t xml:space="preserve">    //h1[text</w:t>
-      </w:r>
-      <w:proofErr w:type="gramStart"/>
-      <w:r>
-        <w:rPr>
-          <w:sz w:val="32"/>
-          <w:szCs w:val="32"/>
-        </w:rPr>
-        <w:t>()=</w:t>
-      </w:r>
-      <w:proofErr w:type="gramEnd"/>
-      <w:r>
-        <w:rPr>
-          <w:sz w:val="32"/>
-          <w:szCs w:val="32"/>
-        </w:rPr>
-        <w:t>’iphone-13’]/../..div/input[@value=’Add to cart’]</w:t>
-      </w:r>
-    </w:p>
-    <w:p>
-      <w:pPr>
-        <w:tabs>
-          <w:tab w:val="left" w:pos="1804"/>
-        </w:tabs>
-        <w:rPr>
-          <w:sz w:val="32"/>
-          <w:szCs w:val="32"/>
-        </w:rPr>
-      </w:pPr>
-      <w:r>
-        <w:rPr>
-          <w:sz w:val="32"/>
-          <w:szCs w:val="32"/>
-        </w:rPr>
-        <w:t>//h1[text</w:t>
-      </w:r>
-      <w:proofErr w:type="gramStart"/>
-      <w:r>
-        <w:rPr>
-          <w:sz w:val="32"/>
-          <w:szCs w:val="32"/>
-        </w:rPr>
-        <w:t>()=</w:t>
-      </w:r>
-      <w:proofErr w:type="gramEnd"/>
-      <w:r>
-        <w:rPr>
-          <w:sz w:val="32"/>
-          <w:szCs w:val="32"/>
-        </w:rPr>
-        <w:t>’iphone-13’]/../following-sibling::div/input[@value=’Add to cart’]</w:t>
+      <w:r>
+        <w:rPr>
+          <w:color w:val="C00000"/>
+          <w:sz w:val="32"/>
+          <w:szCs w:val="32"/>
+        </w:rPr>
+        <w:t xml:space="preserve">EG : </w:t>
+      </w:r>
+    </w:p>
+    <w:p>
+      <w:pPr>
+        <w:tabs>
+          <w:tab w:val="left" w:pos="1804"/>
+        </w:tabs>
+        <w:rPr>
+          <w:sz w:val="32"/>
+          <w:szCs w:val="32"/>
+        </w:rPr>
+      </w:pPr>
+      <w:r>
+        <w:rPr>
+          <w:sz w:val="32"/>
+          <w:szCs w:val="32"/>
+        </w:rPr>
+        <w:t xml:space="preserve">     //h1[text()=’iphone-13’]/../..div[2]/input[@value=’Add to cart’]</w:t>
+      </w:r>
+    </w:p>
+    <w:p>
+      <w:pPr>
+        <w:tabs>
+          <w:tab w:val="left" w:pos="1804"/>
+        </w:tabs>
+        <w:rPr>
+          <w:sz w:val="32"/>
+          <w:szCs w:val="32"/>
+        </w:rPr>
+      </w:pPr>
+      <w:r>
+        <w:rPr>
+          <w:sz w:val="32"/>
+          <w:szCs w:val="32"/>
+        </w:rPr>
+        <w:t xml:space="preserve">    //h1[text()=’iphone-13’]/../..div/input[@value=’Add to cart’]</w:t>
+      </w:r>
+    </w:p>
+    <w:p>
+      <w:pPr>
+        <w:tabs>
+          <w:tab w:val="left" w:pos="1804"/>
+        </w:tabs>
+        <w:rPr>
+          <w:sz w:val="32"/>
+          <w:szCs w:val="32"/>
+        </w:rPr>
+      </w:pPr>
+      <w:r>
+        <w:rPr>
+          <w:sz w:val="32"/>
+          <w:szCs w:val="32"/>
+        </w:rPr>
+        <w:t>//h1[text()=’iphone-13’]/../following-sibling::div/input[@value=’Add to cart’]</w:t>
       </w:r>
     </w:p>
     <w:p>
@@ -7628,33 +6655,15 @@
           <w:sz w:val="32"/>
           <w:szCs w:val="32"/>
         </w:rPr>
-        <w:t xml:space="preserve">Case </w:t>
-      </w:r>
-      <w:proofErr w:type="gramStart"/>
-      <w:r>
-        <w:rPr>
-          <w:color w:val="C00000"/>
-          <w:sz w:val="32"/>
-          <w:szCs w:val="32"/>
-        </w:rPr>
-        <w:t>10</w:t>
-      </w:r>
-      <w:r>
-        <w:rPr>
-          <w:color w:val="C00000"/>
-          <w:sz w:val="32"/>
-          <w:szCs w:val="32"/>
-        </w:rPr>
-        <w:t xml:space="preserve"> :</w:t>
-      </w:r>
-      <w:proofErr w:type="gramEnd"/>
-      <w:r>
-        <w:rPr>
-          <w:color w:val="C00000"/>
-          <w:sz w:val="32"/>
-          <w:szCs w:val="32"/>
-        </w:rPr>
-        <w:t xml:space="preserve"> how to identify the object using </w:t>
+        <w:t>Case 10</w:t>
+      </w:r>
+      <w:r>
+        <w:rPr>
+          <w:color w:val="C00000"/>
+          <w:sz w:val="32"/>
+          <w:szCs w:val="32"/>
+        </w:rPr>
+        <w:t xml:space="preserve"> : how to identify the object using </w:t>
       </w:r>
       <w:r>
         <w:rPr>
@@ -7729,7 +6738,7 @@
           <w:lang w:eastAsia="en-IN"/>
         </w:rPr>
         <w:drawing>
-          <wp:inline distT="0" distB="0" distL="0" distR="0">
+          <wp:inline distT="0" distB="0" distL="0" distR="0" wp14:anchorId="3670CE37" wp14:editId="20A3D5C5">
             <wp:extent cx="5760720" cy="3474720"/>
             <wp:effectExtent l="0" t="0" r="0" b="0"/>
             <wp:docPr id="41" name="Picture 41"/>
@@ -7831,23 +6840,7 @@
           <w:sz w:val="32"/>
           <w:szCs w:val="32"/>
         </w:rPr>
-        <w:t>//span[</w:t>
-      </w:r>
-      <w:proofErr w:type="gramStart"/>
-      <w:r>
-        <w:rPr>
-          <w:sz w:val="32"/>
-          <w:szCs w:val="32"/>
-        </w:rPr>
-        <w:t>text(</w:t>
-      </w:r>
-      <w:proofErr w:type="gramEnd"/>
-      <w:r>
-        <w:rPr>
-          <w:sz w:val="32"/>
-          <w:szCs w:val="32"/>
-        </w:rPr>
-        <w:t>)='Apple iPhone 13 (128GB) - Midnight']</w:t>
+        <w:t>//span[text()='Apple iPhone 13 (128GB) - Midnight']</w:t>
       </w:r>
     </w:p>
     <w:p>
@@ -7896,21 +6889,12 @@
           <w:szCs w:val="32"/>
         </w:rPr>
       </w:pPr>
-      <w:proofErr w:type="gramStart"/>
-      <w:r>
-        <w:rPr>
-          <w:sz w:val="32"/>
-          <w:szCs w:val="32"/>
-        </w:rPr>
-        <w:t>EG :</w:t>
-      </w:r>
-      <w:proofErr w:type="gramEnd"/>
-      <w:r>
-        <w:rPr>
-          <w:sz w:val="32"/>
-          <w:szCs w:val="32"/>
-        </w:rPr>
-        <w:t xml:space="preserve"> with </w:t>
+      <w:r>
+        <w:rPr>
+          <w:sz w:val="32"/>
+          <w:szCs w:val="32"/>
+        </w:rPr>
+        <w:t xml:space="preserve">EG : with </w:t>
       </w:r>
       <w:r>
         <w:rPr>
@@ -7936,23 +6920,7 @@
           <w:sz w:val="32"/>
           <w:szCs w:val="32"/>
         </w:rPr>
-        <w:t>//span[</w:t>
-      </w:r>
-      <w:proofErr w:type="gramStart"/>
-      <w:r>
-        <w:rPr>
-          <w:sz w:val="32"/>
-          <w:szCs w:val="32"/>
-        </w:rPr>
-        <w:t>text(</w:t>
-      </w:r>
-      <w:proofErr w:type="gramEnd"/>
-      <w:r>
-        <w:rPr>
-          <w:sz w:val="32"/>
-          <w:szCs w:val="32"/>
-        </w:rPr>
-        <w:t>)='Apple iPhone 13 (128GB) - Midnight']</w:t>
+        <w:t>//span[text()='Apple iPhone 13 (128GB) - Midnight']</w:t>
       </w:r>
     </w:p>
     <w:p>
@@ -7988,84 +6956,36 @@
           <w:sz w:val="32"/>
           <w:szCs w:val="32"/>
         </w:rPr>
-        <w:t>/</w:t>
-      </w:r>
-      <w:proofErr w:type="gramStart"/>
-      <w:r>
-        <w:rPr>
-          <w:sz w:val="32"/>
-          <w:szCs w:val="32"/>
-        </w:rPr>
-        <w:t>descendant::</w:t>
-      </w:r>
-      <w:proofErr w:type="gramEnd"/>
-      <w:r>
-        <w:rPr>
-          <w:sz w:val="32"/>
-          <w:szCs w:val="32"/>
-        </w:rPr>
-        <w:t>span[@class='a-price']/span[@class='a-</w:t>
-      </w:r>
-      <w:proofErr w:type="spellStart"/>
-      <w:r>
-        <w:rPr>
-          <w:sz w:val="32"/>
-          <w:szCs w:val="32"/>
-        </w:rPr>
-        <w:t>offscreen</w:t>
-      </w:r>
-      <w:proofErr w:type="spellEnd"/>
-      <w:r>
-        <w:rPr>
-          <w:sz w:val="32"/>
-          <w:szCs w:val="32"/>
-        </w:rPr>
-        <w:t>']</w:t>
-      </w:r>
-    </w:p>
-    <w:p>
-      <w:pPr>
-        <w:tabs>
-          <w:tab w:val="left" w:pos="1804"/>
-        </w:tabs>
-        <w:rPr>
-          <w:sz w:val="32"/>
-          <w:szCs w:val="32"/>
-        </w:rPr>
-      </w:pPr>
-    </w:p>
-    <w:p>
-      <w:pPr>
-        <w:tabs>
-          <w:tab w:val="left" w:pos="1804"/>
-        </w:tabs>
-        <w:rPr>
-          <w:sz w:val="32"/>
-          <w:szCs w:val="32"/>
-        </w:rPr>
-      </w:pPr>
-      <w:r>
-        <w:rPr>
-          <w:sz w:val="32"/>
-          <w:szCs w:val="32"/>
-        </w:rPr>
-        <w:t>//span[</w:t>
-      </w:r>
-      <w:proofErr w:type="gramStart"/>
-      <w:r>
-        <w:rPr>
-          <w:sz w:val="32"/>
-          <w:szCs w:val="32"/>
-        </w:rPr>
-        <w:t>text(</w:t>
-      </w:r>
-      <w:proofErr w:type="gramEnd"/>
-      <w:r>
-        <w:rPr>
-          <w:sz w:val="32"/>
-          <w:szCs w:val="32"/>
-        </w:rPr>
-        <w:t>)='Apple iPhone 13 (128GB) - Midnight']</w:t>
+        <w:t>/descendant::span[@class='a-price']/span[@class='a-offscreen']</w:t>
+      </w:r>
+    </w:p>
+    <w:p>
+      <w:pPr>
+        <w:tabs>
+          <w:tab w:val="left" w:pos="1804"/>
+        </w:tabs>
+        <w:rPr>
+          <w:sz w:val="32"/>
+          <w:szCs w:val="32"/>
+        </w:rPr>
+      </w:pPr>
+    </w:p>
+    <w:p>
+      <w:pPr>
+        <w:tabs>
+          <w:tab w:val="left" w:pos="1804"/>
+        </w:tabs>
+        <w:rPr>
+          <w:sz w:val="32"/>
+          <w:szCs w:val="32"/>
+        </w:rPr>
+      </w:pPr>
+      <w:r>
+        <w:rPr>
+          <w:sz w:val="32"/>
+          <w:szCs w:val="32"/>
+        </w:rPr>
+        <w:t>//span[text()='Apple iPhone 13 (128GB) - Midnight']</w:t>
       </w:r>
     </w:p>
     <w:p>
@@ -8101,93 +7021,59 @@
           <w:sz w:val="32"/>
           <w:szCs w:val="32"/>
         </w:rPr>
-        <w:t>//span[@class='a-price']/span[@class='a-</w:t>
-      </w:r>
-      <w:proofErr w:type="spellStart"/>
-      <w:r>
-        <w:rPr>
-          <w:sz w:val="32"/>
-          <w:szCs w:val="32"/>
-        </w:rPr>
-        <w:t>offscreen</w:t>
-      </w:r>
-      <w:proofErr w:type="spellEnd"/>
-      <w:r>
-        <w:rPr>
-          <w:sz w:val="32"/>
-          <w:szCs w:val="32"/>
-        </w:rPr>
-        <w:t>']</w:t>
-      </w:r>
-    </w:p>
-    <w:p>
-      <w:pPr>
-        <w:tabs>
-          <w:tab w:val="left" w:pos="1804"/>
-        </w:tabs>
-        <w:rPr>
-          <w:color w:val="C00000"/>
-          <w:sz w:val="32"/>
-          <w:szCs w:val="32"/>
-        </w:rPr>
-      </w:pPr>
-    </w:p>
-    <w:p>
-      <w:pPr>
-        <w:tabs>
-          <w:tab w:val="left" w:pos="1804"/>
-        </w:tabs>
-        <w:rPr>
-          <w:color w:val="C00000"/>
-          <w:sz w:val="32"/>
-          <w:szCs w:val="32"/>
-        </w:rPr>
-      </w:pPr>
-    </w:p>
-    <w:p>
-      <w:pPr>
-        <w:tabs>
-          <w:tab w:val="left" w:pos="1804"/>
-        </w:tabs>
-        <w:rPr>
-          <w:color w:val="C00000"/>
-          <w:sz w:val="32"/>
-          <w:szCs w:val="32"/>
-        </w:rPr>
-      </w:pPr>
-      <w:r>
-        <w:rPr>
-          <w:color w:val="C00000"/>
-          <w:sz w:val="32"/>
-          <w:szCs w:val="32"/>
-        </w:rPr>
-        <w:t xml:space="preserve">Case </w:t>
-      </w:r>
-      <w:proofErr w:type="gramStart"/>
-      <w:r>
-        <w:rPr>
-          <w:color w:val="C00000"/>
-          <w:sz w:val="32"/>
-          <w:szCs w:val="32"/>
-        </w:rPr>
-        <w:t>11</w:t>
-      </w:r>
-      <w:r>
-        <w:rPr>
-          <w:color w:val="C00000"/>
-          <w:sz w:val="32"/>
-          <w:szCs w:val="32"/>
-        </w:rPr>
-        <w:t xml:space="preserve"> :</w:t>
-      </w:r>
-      <w:proofErr w:type="gramEnd"/>
-      <w:r>
-        <w:rPr>
-          <w:color w:val="C00000"/>
-          <w:sz w:val="32"/>
-          <w:szCs w:val="32"/>
-        </w:rPr>
-        <w:t xml:space="preserve"> how to identify the object using </w:t>
+        <w:t>//span[@class='a-price']/span[@class='a-offscreen']</w:t>
+      </w:r>
+    </w:p>
+    <w:p>
+      <w:pPr>
+        <w:tabs>
+          <w:tab w:val="left" w:pos="1804"/>
+        </w:tabs>
+        <w:rPr>
+          <w:color w:val="C00000"/>
+          <w:sz w:val="32"/>
+          <w:szCs w:val="32"/>
+        </w:rPr>
+      </w:pPr>
+    </w:p>
+    <w:p>
+      <w:pPr>
+        <w:tabs>
+          <w:tab w:val="left" w:pos="1804"/>
+        </w:tabs>
+        <w:rPr>
+          <w:color w:val="C00000"/>
+          <w:sz w:val="32"/>
+          <w:szCs w:val="32"/>
+        </w:rPr>
+      </w:pPr>
+    </w:p>
+    <w:p>
+      <w:pPr>
+        <w:tabs>
+          <w:tab w:val="left" w:pos="1804"/>
+        </w:tabs>
+        <w:rPr>
+          <w:color w:val="C00000"/>
+          <w:sz w:val="32"/>
+          <w:szCs w:val="32"/>
+        </w:rPr>
+      </w:pPr>
+      <w:r>
+        <w:rPr>
+          <w:color w:val="C00000"/>
+          <w:sz w:val="32"/>
+          <w:szCs w:val="32"/>
+        </w:rPr>
+        <w:t>Case 11</w:t>
+      </w:r>
+      <w:r>
+        <w:rPr>
+          <w:color w:val="C00000"/>
+          <w:sz w:val="32"/>
+          <w:szCs w:val="32"/>
+        </w:rPr>
+        <w:t xml:space="preserve"> : how to identify the object using </w:t>
       </w:r>
       <w:r>
         <w:rPr>
@@ -8270,23 +7156,7 @@
           <w:sz w:val="32"/>
           <w:szCs w:val="32"/>
         </w:rPr>
-        <w:t>//span[</w:t>
-      </w:r>
-      <w:proofErr w:type="gramStart"/>
-      <w:r>
-        <w:rPr>
-          <w:sz w:val="32"/>
-          <w:szCs w:val="32"/>
-        </w:rPr>
-        <w:t>text(</w:t>
-      </w:r>
-      <w:proofErr w:type="gramEnd"/>
-      <w:r>
-        <w:rPr>
-          <w:sz w:val="32"/>
-          <w:szCs w:val="32"/>
-        </w:rPr>
-        <w:t>)='Apple iPhone 13 (128GB) - Midnight']</w:t>
+        <w:t>//span[text()='Apple iPhone 13 (128GB) - Midnight']</w:t>
       </w:r>
     </w:p>
     <w:p>
@@ -8308,23 +7178,7 @@
           <w:sz w:val="32"/>
           <w:szCs w:val="32"/>
         </w:rPr>
-        <w:t>/</w:t>
-      </w:r>
-      <w:proofErr w:type="gramStart"/>
-      <w:r>
-        <w:rPr>
-          <w:sz w:val="32"/>
-          <w:szCs w:val="32"/>
-        </w:rPr>
-        <w:t>ancestor::</w:t>
-      </w:r>
-      <w:proofErr w:type="gramEnd"/>
-      <w:r>
-        <w:rPr>
-          <w:sz w:val="32"/>
-          <w:szCs w:val="32"/>
-        </w:rPr>
-        <w:t>div[@class='a-section a-spacing-small a-spacing-top-small']</w:t>
+        <w:t>/ancestor::div[@class='a-section a-spacing-small a-spacing-top-small']</w:t>
       </w:r>
     </w:p>
     <w:p>
@@ -8346,39 +7200,7 @@
           <w:sz w:val="32"/>
           <w:szCs w:val="32"/>
         </w:rPr>
-        <w:t>/</w:t>
-      </w:r>
-      <w:proofErr w:type="gramStart"/>
-      <w:r>
-        <w:rPr>
-          <w:sz w:val="32"/>
-          <w:szCs w:val="32"/>
-        </w:rPr>
-        <w:t>descendant::</w:t>
-      </w:r>
-      <w:proofErr w:type="gramEnd"/>
-      <w:r>
-        <w:rPr>
-          <w:sz w:val="32"/>
-          <w:szCs w:val="32"/>
-        </w:rPr>
-        <w:t>span[@class='a-price']/span[@class='a-</w:t>
-      </w:r>
-      <w:proofErr w:type="spellStart"/>
-      <w:r>
-        <w:rPr>
-          <w:sz w:val="32"/>
-          <w:szCs w:val="32"/>
-        </w:rPr>
-        <w:t>offscreen</w:t>
-      </w:r>
-      <w:proofErr w:type="spellEnd"/>
-      <w:r>
-        <w:rPr>
-          <w:sz w:val="32"/>
-          <w:szCs w:val="32"/>
-        </w:rPr>
-        <w:t>']</w:t>
+        <w:t>/descendant::span[@class='a-price']/span[@class='a-offscreen']</w:t>
       </w:r>
     </w:p>
     <w:p>
@@ -8435,21 +7257,7 @@
         <w:rPr>
           <w:color w:val="C00000"/>
         </w:rPr>
-        <w:t xml:space="preserve">Case </w:t>
-      </w:r>
-      <w:proofErr w:type="gramStart"/>
-      <w:r>
-        <w:rPr>
-          <w:color w:val="C00000"/>
-        </w:rPr>
-        <w:t>12 :</w:t>
-      </w:r>
-      <w:proofErr w:type="gramEnd"/>
-      <w:r>
-        <w:rPr>
-          <w:color w:val="C00000"/>
-        </w:rPr>
-        <w:t xml:space="preserve"> Dynamic </w:t>
+        <w:t xml:space="preserve">Case 12 : Dynamic </w:t>
       </w:r>
       <w:proofErr w:type="spellStart"/>
       <w:r>
@@ -8501,21 +7309,43 @@
       <w:r>
         <w:sym w:font="Wingdings" w:char="F0E8"/>
       </w:r>
+      <w:r>
+        <w:t xml:space="preserve">Dynamix </w:t>
+      </w:r>
       <w:proofErr w:type="spellStart"/>
       <w:r>
-        <w:t>Dynamix</w:t>
+        <w:t>xpath</w:t>
       </w:r>
       <w:proofErr w:type="spellEnd"/>
       <w:r>
+        <w:t xml:space="preserve"> can be used to multiple elements by changing the variable value in runtime </w:t>
+      </w:r>
+    </w:p>
+    <w:p>
+      <w:pPr>
+        <w:tabs>
+          <w:tab w:val="center" w:pos="4513"/>
+        </w:tabs>
+      </w:pPr>
+      <w:r>
+        <w:sym w:font="Wingdings" w:char="F0E8"/>
+      </w:r>
+      <w:r>
         <w:t xml:space="preserve"> </w:t>
       </w:r>
+      <w:r>
+        <w:t xml:space="preserve">Dynamic </w:t>
+      </w:r>
       <w:proofErr w:type="spellStart"/>
       <w:r>
         <w:t>xpath</w:t>
       </w:r>
       <w:proofErr w:type="spellEnd"/>
       <w:r>
-        <w:t xml:space="preserve"> can be used to multiple elements by changing the variable value in runtime </w:t>
+        <w:t xml:space="preserve"> reduces size </w:t>
+      </w:r>
+      <w:r>
+        <w:t>of Elements in Object Repository</w:t>
       </w:r>
     </w:p>
     <w:p>
@@ -8528,10 +7358,7 @@
         <w:sym w:font="Wingdings" w:char="F0E8"/>
       </w:r>
       <w:r>
-        <w:t xml:space="preserve"> </w:t>
-      </w:r>
-      <w:r>
-        <w:t xml:space="preserve">Dynamic </w:t>
+        <w:t xml:space="preserve">In dynamic </w:t>
       </w:r>
       <w:proofErr w:type="spellStart"/>
       <w:r>
@@ -8539,39 +7366,7 @@
       </w:r>
       <w:proofErr w:type="spellEnd"/>
       <w:r>
-        <w:t xml:space="preserve"> reduces size </w:t>
-      </w:r>
-      <w:r>
-        <w:t>of Elements in Object Repository</w:t>
-      </w:r>
-    </w:p>
-    <w:p>
-      <w:pPr>
-        <w:tabs>
-          <w:tab w:val="center" w:pos="4513"/>
-        </w:tabs>
-      </w:pPr>
-      <w:r>
-        <w:sym w:font="Wingdings" w:char="F0E8"/>
-      </w:r>
-      <w:r>
-        <w:t xml:space="preserve">In dynamic </w:t>
-      </w:r>
-      <w:proofErr w:type="spellStart"/>
-      <w:r>
-        <w:t>xpath</w:t>
-      </w:r>
-      <w:proofErr w:type="spellEnd"/>
-      <w:r>
-        <w:t xml:space="preserve"> variable value always comes from External </w:t>
-      </w:r>
-      <w:proofErr w:type="gramStart"/>
-      <w:r>
-        <w:t>File ,</w:t>
-      </w:r>
-      <w:proofErr w:type="gramEnd"/>
-      <w:r>
-        <w:t xml:space="preserve"> but in example variable value is hardcoded</w:t>
+        <w:t xml:space="preserve"> variable value always comes from External File , but in example variable value is hardcoded</w:t>
       </w:r>
     </w:p>
     <w:p>
@@ -8587,7 +7382,7 @@
         </w:rPr>
         <w:lastRenderedPageBreak/>
         <w:drawing>
-          <wp:inline distT="0" distB="0" distL="0" distR="0" wp14:anchorId="0A236471" wp14:editId="78B840EC">
+          <wp:inline distT="0" distB="0" distL="0" distR="0" wp14:anchorId="484CAC79" wp14:editId="408189DB">
             <wp:extent cx="5731510" cy="3222625"/>
             <wp:effectExtent l="0" t="0" r="2540" b="0"/>
             <wp:docPr id="42" name="Picture 42"/>
@@ -8636,8 +7431,6 @@
           <w:tab w:val="center" w:pos="4513"/>
         </w:tabs>
       </w:pPr>
-      <w:bookmarkStart w:id="0" w:name="_GoBack"/>
-      <w:bookmarkEnd w:id="0"/>
     </w:p>
     <w:p>
       <w:pPr>
@@ -9307,23 +8100,13 @@
         <w:t xml:space="preserve">Why </w:t>
       </w:r>
       <w:proofErr w:type="spellStart"/>
-      <w:proofErr w:type="gramStart"/>
       <w:r>
         <w:t>Xpath</w:t>
       </w:r>
       <w:proofErr w:type="spellEnd"/>
       <w:r>
-        <w:t xml:space="preserve"> ?</w:t>
-      </w:r>
-      <w:proofErr w:type="gramEnd"/>
-      <w:r>
-        <w:t xml:space="preserve"> Why not other </w:t>
-      </w:r>
-      <w:proofErr w:type="gramStart"/>
-      <w:r>
-        <w:t>locator ?</w:t>
-      </w:r>
-      <w:proofErr w:type="gramEnd"/>
+        <w:t xml:space="preserve"> ? Why not other locator ?</w:t>
+      </w:r>
     </w:p>
     <w:p>
       <w:pPr>
@@ -9340,17 +8123,12 @@
         <w:t xml:space="preserve">Difference between Absolute &amp; relative </w:t>
       </w:r>
       <w:proofErr w:type="spellStart"/>
-      <w:proofErr w:type="gramStart"/>
       <w:r>
         <w:t>xpath</w:t>
       </w:r>
       <w:proofErr w:type="spellEnd"/>
       <w:r>
-        <w:t xml:space="preserve"> ?</w:t>
-      </w:r>
-      <w:proofErr w:type="gramEnd"/>
-      <w:r>
-        <w:t xml:space="preserve"> </w:t>
+        <w:t xml:space="preserve"> ? </w:t>
       </w:r>
       <w:proofErr w:type="spellStart"/>
       <w:r>
@@ -9358,13 +8136,8 @@
       </w:r>
       <w:proofErr w:type="spellEnd"/>
       <w:r>
-        <w:t xml:space="preserve"> </w:t>
-      </w:r>
-      <w:proofErr w:type="gramStart"/>
-      <w:r>
-        <w:t>types ?</w:t>
-      </w:r>
-      <w:proofErr w:type="gramEnd"/>
+        <w:t xml:space="preserve"> types ?</w:t>
+      </w:r>
     </w:p>
     <w:p>
       <w:pPr>
@@ -9425,15 +8198,7 @@
         <w:t xml:space="preserve"> use </w:t>
       </w:r>
       <w:r>
-        <w:t xml:space="preserve">in </w:t>
-      </w:r>
-      <w:proofErr w:type="gramStart"/>
-      <w:r>
-        <w:t>Selenium ?</w:t>
-      </w:r>
-      <w:proofErr w:type="gramEnd"/>
-      <w:r>
-        <w:t xml:space="preserve"> </w:t>
+        <w:t xml:space="preserve">in Selenium ? </w:t>
       </w:r>
     </w:p>
     <w:p>
@@ -9451,7 +8216,6 @@
         <w:t xml:space="preserve">Disadvantages of </w:t>
       </w:r>
       <w:proofErr w:type="spellStart"/>
-      <w:proofErr w:type="gramStart"/>
       <w:r>
         <w:t>Xpath</w:t>
       </w:r>
@@ -9459,7 +8223,6 @@
       <w:r>
         <w:t xml:space="preserve"> ?</w:t>
       </w:r>
-      <w:proofErr w:type="gramEnd"/>
     </w:p>
     <w:p>
       <w:pPr>
@@ -9484,17 +8247,12 @@
         <w:t xml:space="preserve"> </w:t>
       </w:r>
       <w:proofErr w:type="spellStart"/>
-      <w:proofErr w:type="gramStart"/>
       <w:r>
         <w:t>axces</w:t>
       </w:r>
       <w:proofErr w:type="spellEnd"/>
       <w:r>
-        <w:t xml:space="preserve"> ?</w:t>
-      </w:r>
-      <w:proofErr w:type="gramEnd"/>
-      <w:r>
-        <w:t xml:space="preserve"> </w:t>
+        <w:t xml:space="preserve"> ? </w:t>
       </w:r>
     </w:p>
     <w:p>
@@ -9512,17 +8270,12 @@
         <w:t xml:space="preserve">Methods used in </w:t>
       </w:r>
       <w:proofErr w:type="spellStart"/>
-      <w:proofErr w:type="gramStart"/>
       <w:r>
         <w:t>Xpath</w:t>
       </w:r>
       <w:proofErr w:type="spellEnd"/>
       <w:r>
-        <w:t xml:space="preserve"> ?</w:t>
-      </w:r>
-      <w:proofErr w:type="gramEnd"/>
-      <w:r>
-        <w:t xml:space="preserve"> </w:t>
+        <w:t xml:space="preserve"> ? </w:t>
       </w:r>
     </w:p>
     <w:p>
@@ -9537,13 +8290,8 @@
         </w:tabs>
       </w:pPr>
       <w:r>
-        <w:t xml:space="preserve">How to identify Duplicate </w:t>
-      </w:r>
-      <w:proofErr w:type="gramStart"/>
-      <w:r>
-        <w:t>Object ?</w:t>
-      </w:r>
-      <w:proofErr w:type="gramEnd"/>
+        <w:t>How to identify Duplicate Object ?</w:t>
+      </w:r>
     </w:p>
     <w:p>
       <w:pPr>
@@ -9557,13 +8305,8 @@
         </w:tabs>
       </w:pPr>
       <w:r>
-        <w:t xml:space="preserve">How to identify Dynamic </w:t>
-      </w:r>
-      <w:proofErr w:type="gramStart"/>
-      <w:r>
-        <w:t>Object ?</w:t>
-      </w:r>
-      <w:proofErr w:type="gramEnd"/>
+        <w:t>How to identify Dynamic Object ?</w:t>
+      </w:r>
     </w:p>
     <w:p>
       <w:pPr>
@@ -9578,13 +8321,8 @@
       </w:pPr>
       <w:r>
         <w:lastRenderedPageBreak/>
-        <w:t xml:space="preserve">How to identify multiple Elements using one </w:t>
-      </w:r>
-      <w:proofErr w:type="gramStart"/>
-      <w:r>
-        <w:t>locator ?</w:t>
-      </w:r>
-      <w:proofErr w:type="gramEnd"/>
+        <w:t>How to identify multiple Elements using one locator ?</w:t>
+      </w:r>
     </w:p>
     <w:p>
       <w:pPr>
@@ -9601,7 +8339,6 @@
         <w:t xml:space="preserve">Have you used regular Expression in </w:t>
       </w:r>
       <w:proofErr w:type="spellStart"/>
-      <w:proofErr w:type="gramStart"/>
       <w:r>
         <w:t>xpath</w:t>
       </w:r>
@@ -9609,7 +8346,6 @@
       <w:r>
         <w:t xml:space="preserve"> ?</w:t>
       </w:r>
-      <w:proofErr w:type="gramEnd"/>
     </w:p>
     <w:p>
       <w:pPr>
@@ -9623,13 +8359,8 @@
         </w:tabs>
       </w:pPr>
       <w:r>
-        <w:t xml:space="preserve">How to shadow </w:t>
-      </w:r>
-      <w:proofErr w:type="gramStart"/>
-      <w:r>
-        <w:t>elements ?</w:t>
-      </w:r>
-      <w:proofErr w:type="gramEnd"/>
+        <w:t>How to shadow elements ?</w:t>
+      </w:r>
     </w:p>
     <w:p>
       <w:pPr>
@@ -9643,13 +8374,8 @@
         </w:tabs>
       </w:pPr>
       <w:r>
-        <w:t xml:space="preserve">How to identify Hidden </w:t>
-      </w:r>
-      <w:proofErr w:type="gramStart"/>
-      <w:r>
-        <w:t>Elements ?</w:t>
-      </w:r>
-      <w:proofErr w:type="gramEnd"/>
+        <w:t>How to identify Hidden Elements ?</w:t>
+      </w:r>
     </w:p>
     <w:p>
       <w:pPr>
@@ -9696,17 +8422,12 @@
         <w:t xml:space="preserve">How to Identify the elements in Dynamic </w:t>
       </w:r>
       <w:proofErr w:type="spellStart"/>
-      <w:proofErr w:type="gramStart"/>
       <w:r>
         <w:t>Webtable</w:t>
       </w:r>
       <w:proofErr w:type="spellEnd"/>
       <w:r>
-        <w:t xml:space="preserve"> ?</w:t>
-      </w:r>
-      <w:proofErr w:type="gramEnd"/>
-      <w:r>
-        <w:t xml:space="preserve"> </w:t>
+        <w:t xml:space="preserve"> ? </w:t>
       </w:r>
     </w:p>
     <w:p>
@@ -9736,17 +8457,12 @@
         <w:t xml:space="preserve"> </w:t>
       </w:r>
       <w:proofErr w:type="spellStart"/>
-      <w:proofErr w:type="gramStart"/>
       <w:r>
         <w:t>Webtable</w:t>
       </w:r>
       <w:proofErr w:type="spellEnd"/>
       <w:r>
-        <w:t xml:space="preserve"> ?</w:t>
-      </w:r>
-      <w:proofErr w:type="gramEnd"/>
-      <w:r>
-        <w:t xml:space="preserve"> </w:t>
+        <w:t xml:space="preserve"> ? </w:t>
       </w:r>
     </w:p>
     <w:p>
@@ -9776,17 +8492,12 @@
         <w:t xml:space="preserve"> </w:t>
       </w:r>
       <w:proofErr w:type="spellStart"/>
-      <w:proofErr w:type="gramStart"/>
       <w:r>
         <w:t>Webtable</w:t>
       </w:r>
       <w:proofErr w:type="spellEnd"/>
       <w:r>
-        <w:t xml:space="preserve"> ?</w:t>
-      </w:r>
-      <w:proofErr w:type="gramEnd"/>
-      <w:r>
-        <w:t xml:space="preserve"> </w:t>
+        <w:t xml:space="preserve"> ? </w:t>
       </w:r>
     </w:p>
     <w:p>
@@ -9810,7 +8521,6 @@
         <w:t xml:space="preserve"> Dynamic </w:t>
       </w:r>
       <w:proofErr w:type="spellStart"/>
-      <w:proofErr w:type="gramStart"/>
       <w:r>
         <w:t>Webtable</w:t>
       </w:r>
@@ -9818,7 +8528,6 @@
       <w:r>
         <w:t xml:space="preserve"> ?</w:t>
       </w:r>
-      <w:proofErr w:type="gramEnd"/>
     </w:p>
     <w:p>
       <w:pPr>
@@ -9835,17 +8544,12 @@
         <w:t xml:space="preserve">How to get complete Column elements in dynamic </w:t>
       </w:r>
       <w:proofErr w:type="spellStart"/>
-      <w:proofErr w:type="gramStart"/>
       <w:r>
         <w:t>WebTable</w:t>
       </w:r>
       <w:proofErr w:type="spellEnd"/>
       <w:r>
-        <w:t xml:space="preserve"> ?</w:t>
-      </w:r>
-      <w:proofErr w:type="gramEnd"/>
-      <w:r>
-        <w:t xml:space="preserve"> </w:t>
+        <w:t xml:space="preserve"> ? </w:t>
       </w:r>
     </w:p>
     <w:p>
@@ -9863,17 +8567,104 @@
         <w:t xml:space="preserve">How to get complete Row elements in dynamic </w:t>
       </w:r>
       <w:proofErr w:type="spellStart"/>
-      <w:proofErr w:type="gramStart"/>
       <w:r>
         <w:t>WebTable</w:t>
       </w:r>
       <w:proofErr w:type="spellEnd"/>
       <w:r>
+        <w:t xml:space="preserve"> ? </w:t>
+      </w:r>
+    </w:p>
+    <w:p>
+      <w:pPr>
+        <w:pStyle w:val="ListParagraph"/>
+        <w:numPr>
+          <w:ilvl w:val="0"/>
+          <w:numId w:val="9"/>
+        </w:numPr>
+        <w:tabs>
+          <w:tab w:val="center" w:pos="4513"/>
+        </w:tabs>
+      </w:pPr>
+      <w:r>
+        <w:t xml:space="preserve">How to get complete Row elements in dynamic </w:t>
+      </w:r>
+      <w:proofErr w:type="spellStart"/>
+      <w:r>
+        <w:t>WebTable</w:t>
+      </w:r>
+      <w:proofErr w:type="spellEnd"/>
+      <w:r>
         <w:t xml:space="preserve"> ?</w:t>
       </w:r>
-      <w:proofErr w:type="gramEnd"/>
-      <w:r>
-        <w:t xml:space="preserve"> </w:t>
+    </w:p>
+    <w:p>
+      <w:pPr>
+        <w:pStyle w:val="ListParagraph"/>
+        <w:numPr>
+          <w:ilvl w:val="0"/>
+          <w:numId w:val="9"/>
+        </w:numPr>
+        <w:tabs>
+          <w:tab w:val="center" w:pos="4513"/>
+        </w:tabs>
+      </w:pPr>
+      <w:r>
+        <w:t xml:space="preserve">How to get complete Row elements in dynamic </w:t>
+      </w:r>
+      <w:proofErr w:type="spellStart"/>
+      <w:r>
+        <w:t>WebTable</w:t>
+      </w:r>
+      <w:proofErr w:type="spellEnd"/>
+      <w:r>
+        <w:t xml:space="preserve"> ?</w:t>
+      </w:r>
+    </w:p>
+    <w:p>
+      <w:pPr>
+        <w:pStyle w:val="ListParagraph"/>
+        <w:numPr>
+          <w:ilvl w:val="0"/>
+          <w:numId w:val="9"/>
+        </w:numPr>
+        <w:tabs>
+          <w:tab w:val="center" w:pos="4513"/>
+        </w:tabs>
+      </w:pPr>
+      <w:r>
+        <w:t xml:space="preserve">How to get complete Row elements in dynamic </w:t>
+      </w:r>
+      <w:proofErr w:type="spellStart"/>
+      <w:r>
+        <w:t>WebTable</w:t>
+      </w:r>
+      <w:proofErr w:type="spellEnd"/>
+      <w:r>
+        <w:t xml:space="preserve"> ?</w:t>
+      </w:r>
+    </w:p>
+    <w:p>
+      <w:pPr>
+        <w:pStyle w:val="ListParagraph"/>
+        <w:numPr>
+          <w:ilvl w:val="0"/>
+          <w:numId w:val="9"/>
+        </w:numPr>
+        <w:tabs>
+          <w:tab w:val="center" w:pos="4513"/>
+        </w:tabs>
+      </w:pPr>
+      <w:r>
+        <w:t xml:space="preserve">How to get complete Row elements in dynamic </w:t>
+      </w:r>
+      <w:proofErr w:type="spellStart"/>
+      <w:r>
+        <w:t>WebTable</w:t>
+      </w:r>
+      <w:proofErr w:type="spellEnd"/>
+      <w:r>
+        <w:t xml:space="preserve"> ?</w:t>
       </w:r>
     </w:p>
     <w:p>
@@ -9905,7 +8696,7 @@
 </file>
 
 <file path=word/endnotes.xml><?xml version="1.0" encoding="utf-8"?>
-<w:endnotes xmlns:wpc="http://schemas.microsoft.com/office/word/2010/wordprocessingCanvas" xmlns:cx="http://schemas.microsoft.com/office/drawing/2014/chartex" xmlns:mc="http://schemas.openxmlformats.org/markup-compatibility/2006" xmlns:o="urn:schemas-microsoft-com:office:office" xmlns:r="http://schemas.openxmlformats.org/officeDocument/2006/relationships" xmlns:m="http://schemas.openxmlformats.org/officeDocument/2006/math" xmlns:v="urn:schemas-microsoft-com:vml" xmlns:wp14="http://schemas.microsoft.com/office/word/2010/wordprocessingDrawing" xmlns:wp="http://schemas.openxmlformats.org/drawingml/2006/wordprocessingDrawing" xmlns:w10="urn:schemas-microsoft-com:office:word" xmlns:w="http://schemas.openxmlformats.org/wordprocessingml/2006/main" xmlns:w14="http://schemas.microsoft.com/office/word/2010/wordml" xmlns:w15="http://schemas.microsoft.com/office/word/2012/wordml" xmlns:w16se="http://schemas.microsoft.com/office/word/2015/wordml/symex" xmlns:wpg="http://schemas.microsoft.com/office/word/2010/wordprocessingGroup" xmlns:wpi="http://schemas.microsoft.com/office/word/2010/wordprocessingInk" xmlns:wne="http://schemas.microsoft.com/office/word/2006/wordml" xmlns:wps="http://schemas.microsoft.com/office/word/2010/wordprocessingShape" mc:Ignorable="w14 w15 w16se wp14">
+<w:endnotes xmlns:wpc="http://schemas.microsoft.com/office/word/2010/wordprocessingCanvas" xmlns:cx="http://schemas.microsoft.com/office/drawing/2014/chartex" xmlns:cx1="http://schemas.microsoft.com/office/drawing/2015/9/8/chartex" xmlns:cx2="http://schemas.microsoft.com/office/drawing/2015/10/21/chartex" xmlns:cx3="http://schemas.microsoft.com/office/drawing/2016/5/9/chartex" xmlns:cx4="http://schemas.microsoft.com/office/drawing/2016/5/10/chartex" xmlns:cx5="http://schemas.microsoft.com/office/drawing/2016/5/11/chartex" xmlns:cx6="http://schemas.microsoft.com/office/drawing/2016/5/12/chartex" xmlns:cx7="http://schemas.microsoft.com/office/drawing/2016/5/13/chartex" xmlns:cx8="http://schemas.microsoft.com/office/drawing/2016/5/14/chartex" xmlns:mc="http://schemas.openxmlformats.org/markup-compatibility/2006" xmlns:aink="http://schemas.microsoft.com/office/drawing/2016/ink" xmlns:am3d="http://schemas.microsoft.com/office/drawing/2017/model3d" xmlns:o="urn:schemas-microsoft-com:office:office" xmlns:oel="http://schemas.microsoft.com/office/2019/extlst" xmlns:r="http://schemas.openxmlformats.org/officeDocument/2006/relationships" xmlns:m="http://schemas.openxmlformats.org/officeDocument/2006/math" xmlns:v="urn:schemas-microsoft-com:vml" xmlns:wp14="http://schemas.microsoft.com/office/word/2010/wordprocessingDrawing" xmlns:wp="http://schemas.openxmlformats.org/drawingml/2006/wordprocessingDrawing" xmlns:w10="urn:schemas-microsoft-com:office:word" xmlns:w="http://schemas.openxmlformats.org/wordprocessingml/2006/main" xmlns:w14="http://schemas.microsoft.com/office/word/2010/wordml" xmlns:w15="http://schemas.microsoft.com/office/word/2012/wordml" xmlns:w16cex="http://schemas.microsoft.com/office/word/2018/wordml/cex" xmlns:w16cid="http://schemas.microsoft.com/office/word/2016/wordml/cid" xmlns:w16="http://schemas.microsoft.com/office/word/2018/wordml" xmlns:w16du="http://schemas.microsoft.com/office/word/2023/wordml/word16du" xmlns:w16sdtdh="http://schemas.microsoft.com/office/word/2020/wordml/sdtdatahash" xmlns:w16se="http://schemas.microsoft.com/office/word/2015/wordml/symex" xmlns:wpg="http://schemas.microsoft.com/office/word/2010/wordprocessingGroup" xmlns:wpi="http://schemas.microsoft.com/office/word/2010/wordprocessingInk" xmlns:wne="http://schemas.microsoft.com/office/word/2006/wordml" xmlns:wps="http://schemas.microsoft.com/office/word/2010/wordprocessingShape" mc:Ignorable="w14 w15 w16se w16cid w16 w16cex w16sdtdh w16du wp14">
   <w:endnote w:type="separator" w:id="-1">
     <w:p>
       <w:pPr>
@@ -9930,7 +8721,7 @@
 </file>
 
 <file path=word/footnotes.xml><?xml version="1.0" encoding="utf-8"?>
-<w:footnotes xmlns:wpc="http://schemas.microsoft.com/office/word/2010/wordprocessingCanvas" xmlns:cx="http://schemas.microsoft.com/office/drawing/2014/chartex" xmlns:mc="http://schemas.openxmlformats.org/markup-compatibility/2006" xmlns:o="urn:schemas-microsoft-com:office:office" xmlns:r="http://schemas.openxmlformats.org/officeDocument/2006/relationships" xmlns:m="http://schemas.openxmlformats.org/officeDocument/2006/math" xmlns:v="urn:schemas-microsoft-com:vml" xmlns:wp14="http://schemas.microsoft.com/office/word/2010/wordprocessingDrawing" xmlns:wp="http://schemas.openxmlformats.org/drawingml/2006/wordprocessingDrawing" xmlns:w10="urn:schemas-microsoft-com:office:word" xmlns:w="http://schemas.openxmlformats.org/wordprocessingml/2006/main" xmlns:w14="http://schemas.microsoft.com/office/word/2010/wordml" xmlns:w15="http://schemas.microsoft.com/office/word/2012/wordml" xmlns:w16se="http://schemas.microsoft.com/office/word/2015/wordml/symex" xmlns:wpg="http://schemas.microsoft.com/office/word/2010/wordprocessingGroup" xmlns:wpi="http://schemas.microsoft.com/office/word/2010/wordprocessingInk" xmlns:wne="http://schemas.microsoft.com/office/word/2006/wordml" xmlns:wps="http://schemas.microsoft.com/office/word/2010/wordprocessingShape" mc:Ignorable="w14 w15 w16se wp14">
+<w:footnotes xmlns:wpc="http://schemas.microsoft.com/office/word/2010/wordprocessingCanvas" xmlns:cx="http://schemas.microsoft.com/office/drawing/2014/chartex" xmlns:cx1="http://schemas.microsoft.com/office/drawing/2015/9/8/chartex" xmlns:cx2="http://schemas.microsoft.com/office/drawing/2015/10/21/chartex" xmlns:cx3="http://schemas.microsoft.com/office/drawing/2016/5/9/chartex" xmlns:cx4="http://schemas.microsoft.com/office/drawing/2016/5/10/chartex" xmlns:cx5="http://schemas.microsoft.com/office/drawing/2016/5/11/chartex" xmlns:cx6="http://schemas.microsoft.com/office/drawing/2016/5/12/chartex" xmlns:cx7="http://schemas.microsoft.com/office/drawing/2016/5/13/chartex" xmlns:cx8="http://schemas.microsoft.com/office/drawing/2016/5/14/chartex" xmlns:mc="http://schemas.openxmlformats.org/markup-compatibility/2006" xmlns:aink="http://schemas.microsoft.com/office/drawing/2016/ink" xmlns:am3d="http://schemas.microsoft.com/office/drawing/2017/model3d" xmlns:o="urn:schemas-microsoft-com:office:office" xmlns:oel="http://schemas.microsoft.com/office/2019/extlst" xmlns:r="http://schemas.openxmlformats.org/officeDocument/2006/relationships" xmlns:m="http://schemas.openxmlformats.org/officeDocument/2006/math" xmlns:v="urn:schemas-microsoft-com:vml" xmlns:wp14="http://schemas.microsoft.com/office/word/2010/wordprocessingDrawing" xmlns:wp="http://schemas.openxmlformats.org/drawingml/2006/wordprocessingDrawing" xmlns:w10="urn:schemas-microsoft-com:office:word" xmlns:w="http://schemas.openxmlformats.org/wordprocessingml/2006/main" xmlns:w14="http://schemas.microsoft.com/office/word/2010/wordml" xmlns:w15="http://schemas.microsoft.com/office/word/2012/wordml" xmlns:w16cex="http://schemas.microsoft.com/office/word/2018/wordml/cex" xmlns:w16cid="http://schemas.microsoft.com/office/word/2016/wordml/cid" xmlns:w16="http://schemas.microsoft.com/office/word/2018/wordml" xmlns:w16du="http://schemas.microsoft.com/office/word/2023/wordml/word16du" xmlns:w16sdtdh="http://schemas.microsoft.com/office/word/2020/wordml/sdtdatahash" xmlns:w16se="http://schemas.microsoft.com/office/word/2015/wordml/symex" xmlns:wpg="http://schemas.microsoft.com/office/word/2010/wordprocessingGroup" xmlns:wpi="http://schemas.microsoft.com/office/word/2010/wordprocessingInk" xmlns:wne="http://schemas.microsoft.com/office/word/2006/wordml" xmlns:wps="http://schemas.microsoft.com/office/word/2010/wordprocessingShape" mc:Ignorable="w14 w15 w16se w16cid w16 w16cex w16sdtdh w16du wp14">
   <w:footnote w:type="separator" w:id="-1">
     <w:p>
       <w:pPr>
@@ -9955,7 +8746,7 @@
 </file>
 
 <file path=word/header1.xml><?xml version="1.0" encoding="utf-8"?>
-<w:hdr xmlns:wpc="http://schemas.microsoft.com/office/word/2010/wordprocessingCanvas" xmlns:cx="http://schemas.microsoft.com/office/drawing/2014/chartex" xmlns:mc="http://schemas.openxmlformats.org/markup-compatibility/2006" xmlns:o="urn:schemas-microsoft-com:office:office" xmlns:r="http://schemas.openxmlformats.org/officeDocument/2006/relationships" xmlns:m="http://schemas.openxmlformats.org/officeDocument/2006/math" xmlns:v="urn:schemas-microsoft-com:vml" xmlns:wp14="http://schemas.microsoft.com/office/word/2010/wordprocessingDrawing" xmlns:wp="http://schemas.openxmlformats.org/drawingml/2006/wordprocessingDrawing" xmlns:w10="urn:schemas-microsoft-com:office:word" xmlns:w="http://schemas.openxmlformats.org/wordprocessingml/2006/main" xmlns:w14="http://schemas.microsoft.com/office/word/2010/wordml" xmlns:w15="http://schemas.microsoft.com/office/word/2012/wordml" xmlns:w16se="http://schemas.microsoft.com/office/word/2015/wordml/symex" xmlns:wpg="http://schemas.microsoft.com/office/word/2010/wordprocessingGroup" xmlns:wpi="http://schemas.microsoft.com/office/word/2010/wordprocessingInk" xmlns:wne="http://schemas.microsoft.com/office/word/2006/wordml" xmlns:wps="http://schemas.microsoft.com/office/word/2010/wordprocessingShape" mc:Ignorable="w14 w15 w16se wp14">
+<w:hdr xmlns:wpc="http://schemas.microsoft.com/office/word/2010/wordprocessingCanvas" xmlns:cx="http://schemas.microsoft.com/office/drawing/2014/chartex" xmlns:cx1="http://schemas.microsoft.com/office/drawing/2015/9/8/chartex" xmlns:cx2="http://schemas.microsoft.com/office/drawing/2015/10/21/chartex" xmlns:cx3="http://schemas.microsoft.com/office/drawing/2016/5/9/chartex" xmlns:cx4="http://schemas.microsoft.com/office/drawing/2016/5/10/chartex" xmlns:cx5="http://schemas.microsoft.com/office/drawing/2016/5/11/chartex" xmlns:cx6="http://schemas.microsoft.com/office/drawing/2016/5/12/chartex" xmlns:cx7="http://schemas.microsoft.com/office/drawing/2016/5/13/chartex" xmlns:cx8="http://schemas.microsoft.com/office/drawing/2016/5/14/chartex" xmlns:mc="http://schemas.openxmlformats.org/markup-compatibility/2006" xmlns:aink="http://schemas.microsoft.com/office/drawing/2016/ink" xmlns:am3d="http://schemas.microsoft.com/office/drawing/2017/model3d" xmlns:o="urn:schemas-microsoft-com:office:office" xmlns:oel="http://schemas.microsoft.com/office/2019/extlst" xmlns:r="http://schemas.openxmlformats.org/officeDocument/2006/relationships" xmlns:m="http://schemas.openxmlformats.org/officeDocument/2006/math" xmlns:v="urn:schemas-microsoft-com:vml" xmlns:wp14="http://schemas.microsoft.com/office/word/2010/wordprocessingDrawing" xmlns:wp="http://schemas.openxmlformats.org/drawingml/2006/wordprocessingDrawing" xmlns:w10="urn:schemas-microsoft-com:office:word" xmlns:w="http://schemas.openxmlformats.org/wordprocessingml/2006/main" xmlns:w14="http://schemas.microsoft.com/office/word/2010/wordml" xmlns:w15="http://schemas.microsoft.com/office/word/2012/wordml" xmlns:w16cex="http://schemas.microsoft.com/office/word/2018/wordml/cex" xmlns:w16cid="http://schemas.microsoft.com/office/word/2016/wordml/cid" xmlns:w16="http://schemas.microsoft.com/office/word/2018/wordml" xmlns:w16du="http://schemas.microsoft.com/office/word/2023/wordml/word16du" xmlns:w16sdtdh="http://schemas.microsoft.com/office/word/2020/wordml/sdtdatahash" xmlns:w16se="http://schemas.microsoft.com/office/word/2015/wordml/symex" xmlns:wpg="http://schemas.microsoft.com/office/word/2010/wordprocessingGroup" xmlns:wpi="http://schemas.microsoft.com/office/word/2010/wordprocessingInk" xmlns:wne="http://schemas.microsoft.com/office/word/2006/wordml" xmlns:wps="http://schemas.microsoft.com/office/word/2010/wordprocessingShape" mc:Ignorable="w14 w15 w16se w16cid w16 w16cex w16sdtdh w16du wp14">
   <w:p>
     <w:pPr>
       <w:pStyle w:val="Header"/>
@@ -9968,7 +8759,7 @@
 </file>
 
 <file path=word/numbering.xml><?xml version="1.0" encoding="utf-8"?>
-<w:numbering xmlns:wpc="http://schemas.microsoft.com/office/word/2010/wordprocessingCanvas" xmlns:cx="http://schemas.microsoft.com/office/drawing/2014/chartex" xmlns:mc="http://schemas.openxmlformats.org/markup-compatibility/2006" xmlns:o="urn:schemas-microsoft-com:office:office" xmlns:r="http://schemas.openxmlformats.org/officeDocument/2006/relationships" xmlns:m="http://schemas.openxmlformats.org/officeDocument/2006/math" xmlns:v="urn:schemas-microsoft-com:vml" xmlns:wp14="http://schemas.microsoft.com/office/word/2010/wordprocessingDrawing" xmlns:wp="http://schemas.openxmlformats.org/drawingml/2006/wordprocessingDrawing" xmlns:w10="urn:schemas-microsoft-com:office:word" xmlns:w="http://schemas.openxmlformats.org/wordprocessingml/2006/main" xmlns:w14="http://schemas.microsoft.com/office/word/2010/wordml" xmlns:w15="http://schemas.microsoft.com/office/word/2012/wordml" xmlns:w16se="http://schemas.microsoft.com/office/word/2015/wordml/symex" xmlns:wpg="http://schemas.microsoft.com/office/word/2010/wordprocessingGroup" xmlns:wpi="http://schemas.microsoft.com/office/word/2010/wordprocessingInk" xmlns:wne="http://schemas.microsoft.com/office/word/2006/wordml" xmlns:wps="http://schemas.microsoft.com/office/word/2010/wordprocessingShape" mc:Ignorable="w14 w15 w16se wp14">
+<w:numbering xmlns:wpc="http://schemas.microsoft.com/office/word/2010/wordprocessingCanvas" xmlns:cx="http://schemas.microsoft.com/office/drawing/2014/chartex" xmlns:cx1="http://schemas.microsoft.com/office/drawing/2015/9/8/chartex" xmlns:cx2="http://schemas.microsoft.com/office/drawing/2015/10/21/chartex" xmlns:cx3="http://schemas.microsoft.com/office/drawing/2016/5/9/chartex" xmlns:cx4="http://schemas.microsoft.com/office/drawing/2016/5/10/chartex" xmlns:cx5="http://schemas.microsoft.com/office/drawing/2016/5/11/chartex" xmlns:cx6="http://schemas.microsoft.com/office/drawing/2016/5/12/chartex" xmlns:cx7="http://schemas.microsoft.com/office/drawing/2016/5/13/chartex" xmlns:cx8="http://schemas.microsoft.com/office/drawing/2016/5/14/chartex" xmlns:mc="http://schemas.openxmlformats.org/markup-compatibility/2006" xmlns:aink="http://schemas.microsoft.com/office/drawing/2016/ink" xmlns:am3d="http://schemas.microsoft.com/office/drawing/2017/model3d" xmlns:o="urn:schemas-microsoft-com:office:office" xmlns:oel="http://schemas.microsoft.com/office/2019/extlst" xmlns:r="http://schemas.openxmlformats.org/officeDocument/2006/relationships" xmlns:m="http://schemas.openxmlformats.org/officeDocument/2006/math" xmlns:v="urn:schemas-microsoft-com:vml" xmlns:wp14="http://schemas.microsoft.com/office/word/2010/wordprocessingDrawing" xmlns:wp="http://schemas.openxmlformats.org/drawingml/2006/wordprocessingDrawing" xmlns:w10="urn:schemas-microsoft-com:office:word" xmlns:w="http://schemas.openxmlformats.org/wordprocessingml/2006/main" xmlns:w14="http://schemas.microsoft.com/office/word/2010/wordml" xmlns:w15="http://schemas.microsoft.com/office/word/2012/wordml" xmlns:w16cex="http://schemas.microsoft.com/office/word/2018/wordml/cex" xmlns:w16cid="http://schemas.microsoft.com/office/word/2016/wordml/cid" xmlns:w16="http://schemas.microsoft.com/office/word/2018/wordml" xmlns:w16du="http://schemas.microsoft.com/office/word/2023/wordml/word16du" xmlns:w16sdtdh="http://schemas.microsoft.com/office/word/2020/wordml/sdtdatahash" xmlns:w16se="http://schemas.microsoft.com/office/word/2015/wordml/symex" xmlns:wpg="http://schemas.microsoft.com/office/word/2010/wordprocessingGroup" xmlns:wpi="http://schemas.microsoft.com/office/word/2010/wordprocessingInk" xmlns:wne="http://schemas.microsoft.com/office/word/2006/wordml" xmlns:wps="http://schemas.microsoft.com/office/word/2010/wordprocessingShape" mc:Ignorable="w14 w15 w16se w16cid w16 w16cex w16sdtdh w16du wp14">
   <w:abstractNum w:abstractNumId="0" w15:restartNumberingAfterBreak="0">
     <w:nsid w:val="016B0953"/>
     <w:multiLevelType w:val="hybridMultilevel"/>
@@ -11132,40 +9923,40 @@
       </w:pPr>
     </w:lvl>
   </w:abstractNum>
-  <w:num w:numId="1">
+  <w:num w:numId="1" w16cid:durableId="1459564708">
     <w:abstractNumId w:val="4"/>
   </w:num>
-  <w:num w:numId="2">
+  <w:num w:numId="2" w16cid:durableId="1169105064">
     <w:abstractNumId w:val="0"/>
   </w:num>
-  <w:num w:numId="3">
+  <w:num w:numId="3" w16cid:durableId="1213736556">
     <w:abstractNumId w:val="1"/>
   </w:num>
-  <w:num w:numId="4">
+  <w:num w:numId="4" w16cid:durableId="32855449">
     <w:abstractNumId w:val="11"/>
   </w:num>
-  <w:num w:numId="5">
+  <w:num w:numId="5" w16cid:durableId="650669496">
     <w:abstractNumId w:val="8"/>
   </w:num>
-  <w:num w:numId="6">
+  <w:num w:numId="6" w16cid:durableId="518280928">
     <w:abstractNumId w:val="3"/>
   </w:num>
-  <w:num w:numId="7">
+  <w:num w:numId="7" w16cid:durableId="1954439320">
     <w:abstractNumId w:val="6"/>
   </w:num>
-  <w:num w:numId="8">
+  <w:num w:numId="8" w16cid:durableId="2122022554">
     <w:abstractNumId w:val="5"/>
   </w:num>
-  <w:num w:numId="9">
+  <w:num w:numId="9" w16cid:durableId="1278023983">
     <w:abstractNumId w:val="10"/>
   </w:num>
-  <w:num w:numId="10">
+  <w:num w:numId="10" w16cid:durableId="1312295257">
     <w:abstractNumId w:val="2"/>
   </w:num>
-  <w:num w:numId="11">
+  <w:num w:numId="11" w16cid:durableId="1394545451">
     <w:abstractNumId w:val="7"/>
   </w:num>
-  <w:num w:numId="12">
+  <w:num w:numId="12" w16cid:durableId="427849972">
     <w:abstractNumId w:val="9"/>
   </w:num>
   <w:numIdMacAtCleanup w:val="12"/>
@@ -11173,7 +9964,7 @@
 </file>
 
 <file path=word/styles.xml><?xml version="1.0" encoding="utf-8"?>
-<w:styles xmlns:mc="http://schemas.openxmlformats.org/markup-compatibility/2006" xmlns:r="http://schemas.openxmlformats.org/officeDocument/2006/relationships" xmlns:w="http://schemas.openxmlformats.org/wordprocessingml/2006/main" xmlns:w14="http://schemas.microsoft.com/office/word/2010/wordml" xmlns:w15="http://schemas.microsoft.com/office/word/2012/wordml" xmlns:w16se="http://schemas.microsoft.com/office/word/2015/wordml/symex" mc:Ignorable="w14 w15 w16se">
+<w:styles xmlns:mc="http://schemas.openxmlformats.org/markup-compatibility/2006" xmlns:r="http://schemas.openxmlformats.org/officeDocument/2006/relationships" xmlns:w="http://schemas.openxmlformats.org/wordprocessingml/2006/main" xmlns:w14="http://schemas.microsoft.com/office/word/2010/wordml" xmlns:w15="http://schemas.microsoft.com/office/word/2012/wordml" xmlns:w16cex="http://schemas.microsoft.com/office/word/2018/wordml/cex" xmlns:w16cid="http://schemas.microsoft.com/office/word/2016/wordml/cid" xmlns:w16="http://schemas.microsoft.com/office/word/2018/wordml" xmlns:w16du="http://schemas.microsoft.com/office/word/2023/wordml/word16du" xmlns:w16sdtdh="http://schemas.microsoft.com/office/word/2020/wordml/sdtdatahash" xmlns:w16se="http://schemas.microsoft.com/office/word/2015/wordml/symex" mc:Ignorable="w14 w15 w16se w16cid w16 w16cex w16sdtdh w16du">
   <w:docDefaults>
     <w:rPrDefault>
       <w:rPr>
@@ -11189,7 +9980,7 @@
       </w:pPr>
     </w:pPrDefault>
   </w:docDefaults>
-  <w:latentStyles w:defLockedState="0" w:defUIPriority="99" w:defSemiHidden="0" w:defUnhideWhenUsed="0" w:defQFormat="0" w:count="371">
+  <w:latentStyles w:defLockedState="0" w:defUIPriority="99" w:defSemiHidden="0" w:defUnhideWhenUsed="0" w:defQFormat="0" w:count="376">
     <w:lsdException w:name="Normal" w:uiPriority="0" w:qFormat="1"/>
     <w:lsdException w:name="heading 1" w:uiPriority="9" w:qFormat="1"/>
     <w:lsdException w:name="heading 2" w:semiHidden="1" w:uiPriority="9" w:unhideWhenUsed="1" w:qFormat="1"/>
@@ -11561,6 +10352,11 @@
     <w:lsdException w:name="List Table 5 Dark Accent 6" w:uiPriority="50"/>
     <w:lsdException w:name="List Table 6 Colorful Accent 6" w:uiPriority="51"/>
     <w:lsdException w:name="List Table 7 Colorful Accent 6" w:uiPriority="52"/>
+    <w:lsdException w:name="Mention" w:semiHidden="1" w:unhideWhenUsed="1"/>
+    <w:lsdException w:name="Smart Hyperlink" w:semiHidden="1" w:unhideWhenUsed="1"/>
+    <w:lsdException w:name="Hashtag" w:semiHidden="1" w:unhideWhenUsed="1"/>
+    <w:lsdException w:name="Unresolved Mention" w:semiHidden="1" w:unhideWhenUsed="1"/>
+    <w:lsdException w:name="Smart Link" w:semiHidden="1" w:unhideWhenUsed="1"/>
   </w:latentStyles>
   <w:style w:type="paragraph" w:default="1" w:styleId="Normal">
     <w:name w:val="Normal"/>
@@ -11657,6 +10453,7 @@
   <w:style w:type="character" w:default="1" w:styleId="DefaultParagraphFont">
     <w:name w:val="Default Paragraph Font"/>
     <w:uiPriority w:val="1"/>
+    <w:semiHidden/>
     <w:unhideWhenUsed/>
   </w:style>
   <w:style w:type="table" w:default="1" w:styleId="TableNormal">

</xml_diff>